<commit_message>
Deploying to gh-pages from @ Morrison-Lab/mds@c96e2f8625baf352432f23025b70e1329db0b313 🚀
</commit_message>
<xml_diff>
--- a/linear-algebra-diagonalization.docx
+++ b/linear-algebra-diagonalization.docx
@@ -15,7 +15,7 @@
         <w:pStyle w:val="Date"/>
       </w:pPr>
       <w:r>
-        <w:t xml:space="preserve">Last modified: 2026-10-09 22:14:55 (PDT)</w:t>
+        <w:t xml:space="preserve">Last modified: 2026-10-10 10:38:55 (PDT)</w:t>
       </w:r>
     </w:p>
     <w:bookmarkStart w:id="78" w:name="sec-diagonalization"/>
@@ -1203,7 +1203,7 @@
           <w:rPr>
             <w:rStyle w:val="Hyperlink"/>
           </w:rPr>
-          <w:t xml:space="preserve">Theorem 17 in Subspaces and Rank</w:t>
+          <w:t xml:space="preserve">Theorem 6 in Column Space, Null Space and Rank-Nullity</w:t>
         </w:r>
       </w:hyperlink>
       <w:r>
@@ -2299,7 +2299,7 @@
           <w:rPr>
             <w:rStyle w:val="Hyperlink"/>
           </w:rPr>
-          <w:t xml:space="preserve">Theorem 17 in Subspaces and Rank</w:t>
+          <w:t xml:space="preserve">Theorem 6 in Column Space, Null Space and Rank-Nullity</w:t>
         </w:r>
       </w:hyperlink>
       <w:r>
@@ -3307,7 +3307,7 @@
           <w:rPr>
             <w:rStyle w:val="Hyperlink"/>
           </w:rPr>
-          <w:t xml:space="preserve">Theorem 13 in Subspaces and Rank</w:t>
+          <w:t xml:space="preserve">Theorem 2 in Column Space, Null Space and Rank-Nullity</w:t>
         </w:r>
       </w:hyperlink>
       <w:r>
@@ -6398,7 +6398,7 @@
           <w:rPr>
             <w:rStyle w:val="Hyperlink"/>
           </w:rPr>
-          <w:t xml:space="preserve">Theorem 13 in Subspaces and Rank</w:t>
+          <w:t xml:space="preserve">Theorem 2 in Column Space, Null Space and Rank-Nullity</w:t>
         </w:r>
       </w:hyperlink>
       <w:r>
@@ -45096,7 +45096,7 @@
                   <m:nor/>
                   <m:sty m:val="p"/>
                 </m:rPr>
-                <m:t>Theorem 28 in Subspaces and Rank</m:t>
+                <m:t>Theorem 5 in Direct Sums and Orthogonal Complements</m:t>
               </m:r>
               <m:r>
                 <m:rPr>
@@ -46503,7 +46503,7 @@
                   <m:nor/>
                   <m:sty m:val="p"/>
                 </m:rPr>
-                <m:t>Theorem 28 in Subspaces and Rank</m:t>
+                <m:t>Theorem 5 in Direct Sums and Orthogonal Complements</m:t>
               </m:r>
               <m:r>
                 <m:rPr>

</xml_diff>

<commit_message>
Deploying to gh-pages from @ Morrison-Lab/mds@1322600734f969cf499fb6a36036f54fad3a0a92 🚀
</commit_message>
<xml_diff>
--- a/linear-algebra-diagonalization.docx
+++ b/linear-algebra-diagonalization.docx
@@ -15,7 +15,7 @@
         <w:pStyle w:val="Date"/>
       </w:pPr>
       <w:r>
-        <w:t xml:space="preserve">Last modified: 2026-10-12 21:21:07 (PDT)</w:t>
+        <w:t xml:space="preserve">Last modified: 2026-10-12 22:07:53 (PDT)</w:t>
       </w:r>
     </w:p>
     <w:bookmarkStart w:id="78" w:name="sec-diagonalization"/>
@@ -1203,7 +1203,7 @@
           <w:rPr>
             <w:rStyle w:val="Hyperlink"/>
           </w:rPr>
-          <w:t xml:space="preserve">Theorem 6 in Column Space, Null Space and Rank-Nullity</w:t>
+          <w:t xml:space="preserve">Theorem 7 in Column Space, Null Space and Rank-Nullity</w:t>
         </w:r>
       </w:hyperlink>
       <w:r>
@@ -2299,7 +2299,7 @@
           <w:rPr>
             <w:rStyle w:val="Hyperlink"/>
           </w:rPr>
-          <w:t xml:space="preserve">Theorem 6 in Column Space, Null Space and Rank-Nullity</w:t>
+          <w:t xml:space="preserve">Theorem 7 in Column Space, Null Space and Rank-Nullity</w:t>
         </w:r>
       </w:hyperlink>
       <w:r>

</xml_diff>

<commit_message>
Deploying to gh-pages from @ Morrison-Lab/mds@924e71c487be9bb35ced6e5b1b92adf5190b901f 🚀
</commit_message>
<xml_diff>
--- a/linear-algebra-diagonalization.docx
+++ b/linear-algebra-diagonalization.docx
@@ -15,7 +15,7 @@
         <w:pStyle w:val="Date"/>
       </w:pPr>
       <w:r>
-        <w:t xml:space="preserve">Last modified: 2026-10-14 01:48:43 (PDT)</w:t>
+        <w:t xml:space="preserve">Last modified: 2026-10-14 08:08:00 (PDT)</w:t>
       </w:r>
     </w:p>
     <w:bookmarkStart w:id="78" w:name="sec-diagonalization"/>
@@ -41690,7 +41690,7 @@
           <w:rPr>
             <w:rStyle w:val="Hyperlink"/>
           </w:rPr>
-          <w:t xml:space="preserve">Definition 22 in Special Matrices and Decompositions</w:t>
+          <w:t xml:space="preserve">Definition 23 in Special Matrices and Decompositions</w:t>
         </w:r>
       </w:hyperlink>
       <w:r>

</xml_diff>

<commit_message>
Deploying to gh-pages from @ Morrison-Lab/mds@4da60e00929b143f0f53ba8497914200302455b7 🚀
</commit_message>
<xml_diff>
--- a/linear-algebra-diagonalization.docx
+++ b/linear-algebra-diagonalization.docx
@@ -15,7 +15,7 @@
         <w:pStyle w:val="Date"/>
       </w:pPr>
       <w:r>
-        <w:t xml:space="preserve">Last modified: 2026-10-17 06:29:34 (PDT)</w:t>
+        <w:t xml:space="preserve">Last modified: 2026-10-17 07:35:34 (PDT)</w:t>
       </w:r>
     </w:p>
     <w:bookmarkStart w:id="79" w:name="sec-diagonalization"/>
@@ -24036,7 +24036,7 @@
     </w:p>
     <w:bookmarkEnd w:id="78"/>
     <w:bookmarkEnd w:id="79"/>
-    <w:bookmarkStart w:id="123" w:name="sec-cholesky"/>
+    <w:bookmarkStart w:id="130" w:name="sec-cholesky"/>
     <w:p>
       <w:pPr>
         <w:pStyle w:val="Heading2"/>
@@ -29546,10 +29546,2229 @@
       </w:r>
     </w:p>
     <w:bookmarkEnd w:id="98"/>
-    <w:bookmarkStart w:id="99" w:name="def-block-matrix"/>
+    <w:bookmarkStart w:id="99" w:name="thm-pd-invertible"/>
     <w:p>
       <w:pPr>
         <w:pStyle w:val="FirstParagraph"/>
+      </w:pPr>
+      <w:r>
+        <w:rPr>
+          <w:b/>
+          <w:bCs/>
+        </w:rPr>
+        <w:t xml:space="preserve">Theorem 12 (A positive definite matrix is invertible)</w:t>
+      </w:r>
+      <w:r>
+        <w:t xml:space="preserve"> </w:t>
+      </w:r>
+      <w:r>
+        <w:t xml:space="preserve">Every positive definite matrix (</w:t>
+      </w:r>
+      <w:hyperlink r:id="rId84">
+        <w:r>
+          <w:rPr>
+            <w:rStyle w:val="Hyperlink"/>
+          </w:rPr>
+          <w:t xml:space="preserve">Definition 22 in Special Matrices and Decompositions</w:t>
+        </w:r>
+      </w:hyperlink>
+      <w:r>
+        <w:t xml:space="preserve">) is invertible (</w:t>
+      </w:r>
+      <w:hyperlink r:id="rId15">
+        <w:r>
+          <w:rPr>
+            <w:rStyle w:val="Hyperlink"/>
+          </w:rPr>
+          <w:t xml:space="preserve">Definition 6 in Special Matrices and Decompositions</w:t>
+        </w:r>
+      </w:hyperlink>
+      <w:r>
+        <w:t xml:space="preserve">).</w:t>
+      </w:r>
+    </w:p>
+    <w:bookmarkEnd w:id="99"/>
+    <w:p>
+      <w:pPr>
+        <w:pStyle w:val="BodyText"/>
+      </w:pPr>
+      <w:r>
+        <w:rPr>
+          <w:i/>
+          <w:iCs/>
+        </w:rPr>
+        <w:t xml:space="preserve">Proof</w:t>
+      </w:r>
+      <w:r>
+        <w:t xml:space="preserve">. </w:t>
+      </w:r>
+      <w:r>
+        <w:t xml:space="preserve">Let</w:t>
+      </w:r>
+      <w:r>
+        <w:t xml:space="preserve"> </w:t>
+      </w:r>
+      <m:oMath>
+        <m:r>
+          <m:rPr>
+            <m:sty m:val="bi"/>
+          </m:rPr>
+          <m:t>A</m:t>
+        </m:r>
+      </m:oMath>
+      <w:r>
+        <w:t xml:space="preserve"> </w:t>
+      </w:r>
+      <w:r>
+        <w:t xml:space="preserve">be a</w:t>
+      </w:r>
+      <w:r>
+        <w:t xml:space="preserve"> </w:t>
+      </w:r>
+      <m:oMath>
+        <m:r>
+          <m:t>p</m:t>
+        </m:r>
+        <m:r>
+          <m:rPr>
+            <m:sty m:val="p"/>
+          </m:rPr>
+          <m:t>×</m:t>
+        </m:r>
+        <m:r>
+          <m:t>p</m:t>
+        </m:r>
+      </m:oMath>
+      <w:r>
+        <w:t xml:space="preserve"> </w:t>
+      </w:r>
+      <w:r>
+        <w:t xml:space="preserve">positive definite matrix,</w:t>
+      </w:r>
+      <w:r>
+        <w:t xml:space="preserve"> </w:t>
+      </w:r>
+      <w:r>
+        <w:t xml:space="preserve">and let</w:t>
+      </w:r>
+      <w:r>
+        <w:t xml:space="preserve"> </w:t>
+      </w:r>
+      <w:r>
+        <w:t xml:space="preserve">$\mathord{\smash[b]{\underset{\raise.3ex\hbox{$\scriptstyle\sim$}}{x}}\vphantom{x}}$</w:t>
+      </w:r>
+      <w:r>
+        <w:t xml:space="preserve"> </w:t>
+      </w:r>
+      <w:r>
+        <w:t xml:space="preserve">be a vector of length</w:t>
+      </w:r>
+      <w:r>
+        <w:t xml:space="preserve"> </w:t>
+      </w:r>
+      <m:oMath>
+        <m:r>
+          <m:t>p</m:t>
+        </m:r>
+      </m:oMath>
+      <w:r>
+        <w:t xml:space="preserve"> </w:t>
+      </w:r>
+      <w:r>
+        <w:t xml:space="preserve">with</w:t>
+      </w:r>
+      <w:r>
+        <w:t xml:space="preserve"> </w:t>
+      </w:r>
+      <w:r>
+        <w:t xml:space="preserve">$\mathbf{A} \mathord{\smash[b]{\underset{\raise.3ex\hbox{$\scriptstyle\sim$}}{x}}\vphantom{x}}= \mathord{\smash[b]{\underset{\raise.3ex\hbox{$\scriptstyle\sim$}}{0}}\vphantom{0}}_p$</w:t>
+      </w:r>
+      <w:r>
+        <w:t xml:space="preserve">.</w:t>
+      </w:r>
+      <w:r>
+        <w:t xml:space="preserve"> </w:t>
+      </w:r>
+      <w:r>
+        <w:t xml:space="preserve">Then</w:t>
+      </w:r>
+    </w:p>
+    <w:p>
+      <w:pPr>
+        <w:pStyle w:val="BodyText"/>
+      </w:pPr>
+      <w:r>
+        <w:t xml:space="preserve">$$
+    \begin{aligned}
+    {\mathord{\smash[b]{\underset{\raise.3ex\hbox{$\scriptstyle\sim$}}{x}}\vphantom{x}}}^{\top} \mathbf{A} \mathord{\smash[b]{\underset{\raise.3ex\hbox{$\scriptstyle\sim$}}{x}}\vphantom{x}}
+    &amp;= {\mathord{\smash[b]{\underset{\raise.3ex\hbox{$\scriptstyle\sim$}}{x}}\vphantom{x}}}^{\top}\,(\mathbf{A} \mathord{\smash[b]{\underset{\raise.3ex\hbox{$\scriptstyle\sim$}}{x}}\vphantom{x}})
+    &amp;&amp; \text{(}\text{Definition~11 in Special Matrices and Decompositions}\text{)}
+    \\
+    &amp;= {\mathord{\smash[b]{\underset{\raise.3ex\hbox{$\scriptstyle\sim$}}{x}}\vphantom{x}}}^{\top}\,\mathord{\smash[b]{\underset{\raise.3ex\hbox{$\scriptstyle\sim$}}{0}}\vphantom{0}}_p
+    &amp;&amp; \text{(} \mathbf{A} \mathord{\smash[b]{\underset{\raise.3ex\hbox{$\scriptstyle\sim$}}{x}}\vphantom{x}}= \mathord{\smash[b]{\underset{\raise.3ex\hbox{$\scriptstyle\sim$}}{0}}\vphantom{0}}_p \text{)}
+    \\
+    &amp;= 0.
+    &amp;&amp; \text{(every term of the inner product is } 0 \text{)}
+    \end{aligned}
+    $$</w:t>
+      </w:r>
+    </w:p>
+    <w:p>
+      <w:pPr>
+        <w:pStyle w:val="FirstParagraph"/>
+      </w:pPr>
+      <w:r>
+        <w:t xml:space="preserve">If</w:t>
+      </w:r>
+      <w:r>
+        <w:t xml:space="preserve"> </w:t>
+      </w:r>
+      <w:r>
+        <w:t xml:space="preserve">$\mathord{\smash[b]{\underset{\raise.3ex\hbox{$\scriptstyle\sim$}}{x}}\vphantom{x}}\ne \mathord{\smash[b]{\underset{\raise.3ex\hbox{$\scriptstyle\sim$}}{0}}\vphantom{0}}_p$</w:t>
+      </w:r>
+      <w:r>
+        <w:t xml:space="preserve">, then</w:t>
+      </w:r>
+      <w:r>
+        <w:t xml:space="preserve"> </w:t>
+      </w:r>
+      <w:r>
+        <w:t xml:space="preserve">${\mathord{\smash[b]{\underset{\raise.3ex\hbox{$\scriptstyle\sim$}}{x}}\vphantom{x}}}^{\top} \mathbf{A} \mathord{\smash[b]{\underset{\raise.3ex\hbox{$\scriptstyle\sim$}}{x}}\vphantom{x}} &gt; 0$</w:t>
+      </w:r>
+      <w:r>
+        <w:t xml:space="preserve"> </w:t>
+      </w:r>
+      <w:r>
+        <w:t xml:space="preserve">because</w:t>
+      </w:r>
+      <w:r>
+        <w:t xml:space="preserve"> </w:t>
+      </w:r>
+      <m:oMath>
+        <m:r>
+          <m:rPr>
+            <m:sty m:val="bi"/>
+          </m:rPr>
+          <m:t>A</m:t>
+        </m:r>
+      </m:oMath>
+      <w:r>
+        <w:t xml:space="preserve"> </w:t>
+      </w:r>
+      <w:r>
+        <w:t xml:space="preserve">is positive definite,</w:t>
+      </w:r>
+      <w:r>
+        <w:t xml:space="preserve"> </w:t>
+      </w:r>
+      <w:r>
+        <w:t xml:space="preserve">which contradicts</w:t>
+      </w:r>
+      <w:r>
+        <w:t xml:space="preserve"> </w:t>
+      </w:r>
+      <w:r>
+        <w:t xml:space="preserve">${\mathord{\smash[b]{\underset{\raise.3ex\hbox{$\scriptstyle\sim$}}{x}}\vphantom{x}}}^{\top} \mathbf{A} \mathord{\smash[b]{\underset{\raise.3ex\hbox{$\scriptstyle\sim$}}{x}}\vphantom{x}} = 0$</w:t>
+      </w:r>
+      <w:r>
+        <w:t xml:space="preserve">.</w:t>
+      </w:r>
+      <w:r>
+        <w:t xml:space="preserve"> </w:t>
+      </w:r>
+      <w:r>
+        <w:t xml:space="preserve">So</w:t>
+      </w:r>
+      <w:r>
+        <w:t xml:space="preserve"> </w:t>
+      </w:r>
+      <w:r>
+        <w:t xml:space="preserve">$\mathord{\smash[b]{\underset{\raise.3ex\hbox{$\scriptstyle\sim$}}{x}}\vphantom{x}}= \mathord{\smash[b]{\underset{\raise.3ex\hbox{$\scriptstyle\sim$}}{0}}\vphantom{0}}_p$</w:t>
+      </w:r>
+      <w:r>
+        <w:t xml:space="preserve">, the null space</w:t>
+      </w:r>
+      <w:r>
+        <w:t xml:space="preserve"> </w:t>
+      </w:r>
+      <m:oMath>
+        <m:r>
+          <m:rPr>
+            <m:scr m:val="script"/>
+            <m:sty m:val="p"/>
+          </m:rPr>
+          <m:t>N</m:t>
+        </m:r>
+        <m:r>
+          <m:rPr>
+            <m:sty m:val="p"/>
+          </m:rPr>
+          <m:t>(</m:t>
+        </m:r>
+        <m:r>
+          <m:rPr>
+            <m:sty m:val="bi"/>
+          </m:rPr>
+          <m:t>A</m:t>
+        </m:r>
+        <m:r>
+          <m:rPr>
+            <m:sty m:val="p"/>
+          </m:rPr>
+          <m:t>)</m:t>
+        </m:r>
+      </m:oMath>
+      <w:r>
+        <w:t xml:space="preserve"> </w:t>
+      </w:r>
+      <w:r>
+        <w:t xml:space="preserve">is</w:t>
+      </w:r>
+      <w:r>
+        <w:t xml:space="preserve"> </w:t>
+      </w:r>
+      <w:r>
+        <w:t xml:space="preserve">$\mathopen{}\left\{\mathord{\smash[b]{\underset{\raise.3ex\hbox{$\scriptstyle\sim$}}{0}}\vphantom{0}}_p\right\}\mathclose{}$</w:t>
+      </w:r>
+      <w:r>
+        <w:t xml:space="preserve">,</w:t>
+      </w:r>
+      <w:r>
+        <w:t xml:space="preserve"> </w:t>
+      </w:r>
+      <w:r>
+        <w:t xml:space="preserve">and</w:t>
+      </w:r>
+      <w:r>
+        <w:t xml:space="preserve"> </w:t>
+      </w:r>
+      <m:oMath>
+        <m:r>
+          <m:rPr>
+            <m:sty m:val="bi"/>
+          </m:rPr>
+          <m:t>A</m:t>
+        </m:r>
+      </m:oMath>
+      <w:r>
+        <w:t xml:space="preserve"> </w:t>
+      </w:r>
+      <w:r>
+        <w:t xml:space="preserve">is invertible by</w:t>
+      </w:r>
+      <w:r>
+        <w:t xml:space="preserve"> </w:t>
+      </w:r>
+      <w:hyperlink w:anchor="thm-invertible-rank">
+        <w:r>
+          <w:rPr>
+            <w:rStyle w:val="Hyperlink"/>
+          </w:rPr>
+          <w:t xml:space="preserve">Theorem 1</w:t>
+        </w:r>
+      </w:hyperlink>
+      <w:r>
+        <w:t xml:space="preserve">.</w:t>
+      </w:r>
+    </w:p>
+    <w:bookmarkStart w:id="100" w:name="exm-pd-invertible"/>
+    <w:p>
+      <w:pPr>
+        <w:pStyle w:val="BodyText"/>
+      </w:pPr>
+      <w:r>
+        <w:rPr>
+          <w:b/>
+          <w:bCs/>
+        </w:rPr>
+        <w:t xml:space="preserve">Example 17 (Positive definite matrices are invertible; the converse fails)</w:t>
+      </w:r>
+      <w:r>
+        <w:t xml:space="preserve"> </w:t>
+      </w:r>
+      <m:oMath>
+        <m:r>
+          <m:rPr>
+            <m:sty m:val="bi"/>
+          </m:rPr>
+          <m:t>A</m:t>
+        </m:r>
+        <m:r>
+          <m:rPr>
+            <m:sty m:val="p"/>
+          </m:rPr>
+          <m:t>=</m:t>
+        </m:r>
+        <m:d>
+          <m:dPr>
+            <m:begChr m:val="["/>
+            <m:sepChr m:val=""/>
+            <m:endChr m:val="]"/>
+            <m:grow/>
+          </m:dPr>
+          <m:e>
+            <m:m>
+              <m:mPr>
+                <m:baseJc m:val="center"/>
+                <m:plcHide m:val="on"/>
+                <m:mcs>
+                  <m:mc>
+                    <m:mcPr>
+                      <m:mcJc m:val="center"/>
+                      <m:count m:val="1"/>
+                    </m:mcPr>
+                  </m:mc>
+                  <m:mc>
+                    <m:mcPr>
+                      <m:mcJc m:val="center"/>
+                      <m:count m:val="1"/>
+                    </m:mcPr>
+                  </m:mc>
+                </m:mcs>
+              </m:mPr>
+              <m:mr>
+                <m:e>
+                  <m:r>
+                    <m:t>2</m:t>
+                  </m:r>
+                </m:e>
+                <m:e>
+                  <m:r>
+                    <m:t>1</m:t>
+                  </m:r>
+                </m:e>
+              </m:mr>
+              <m:mr>
+                <m:e>
+                  <m:r>
+                    <m:t>1</m:t>
+                  </m:r>
+                </m:e>
+                <m:e>
+                  <m:r>
+                    <m:t>2</m:t>
+                  </m:r>
+                </m:e>
+              </m:mr>
+            </m:m>
+          </m:e>
+        </m:d>
+      </m:oMath>
+      <w:r>
+        <w:t xml:space="preserve"> </w:t>
+      </w:r>
+      <w:r>
+        <w:t xml:space="preserve">is positive definite, since</w:t>
+      </w:r>
+    </w:p>
+    <w:p>
+      <w:pPr>
+        <w:pStyle w:val="BodyText"/>
+      </w:pPr>
+      <w:r>
+        <w:t xml:space="preserve">$$
+    \begin{aligned}
+    {\mathord{\smash[b]{\underset{\raise.3ex\hbox{$\scriptstyle\sim$}}{x}}\vphantom{x}}}^{\top} \mathbf{A} \mathord{\smash[b]{\underset{\raise.3ex\hbox{$\scriptstyle\sim$}}{x}}\vphantom{x}}
+    &amp;= 2 x_1^2 + 2 x_1 x_2 + 2 x_2^2
+    &amp;&amp; \text{(multiply out)}
+    \\
+    &amp;= x_1^2 + x_2^2 + (x_1 + x_2)^2,
+    &amp;&amp; \text{(expand the square)}
+    \end{aligned}
+    $$</w:t>
+      </w:r>
+    </w:p>
+    <w:p>
+      <w:pPr>
+        <w:pStyle w:val="FirstParagraph"/>
+      </w:pPr>
+      <w:r>
+        <w:t xml:space="preserve">which is</w:t>
+      </w:r>
+      <w:r>
+        <w:t xml:space="preserve"> </w:t>
+      </w:r>
+      <m:oMath>
+        <m:r>
+          <m:t>0</m:t>
+        </m:r>
+      </m:oMath>
+      <w:r>
+        <w:t xml:space="preserve"> </w:t>
+      </w:r>
+      <w:r>
+        <w:t xml:space="preserve">only when</w:t>
+      </w:r>
+      <w:r>
+        <w:t xml:space="preserve"> </w:t>
+      </w:r>
+      <m:oMath>
+        <m:sSub>
+          <m:e>
+            <m:r>
+              <m:t>x</m:t>
+            </m:r>
+          </m:e>
+          <m:sub>
+            <m:r>
+              <m:t>1</m:t>
+            </m:r>
+          </m:sub>
+        </m:sSub>
+        <m:r>
+          <m:rPr>
+            <m:sty m:val="p"/>
+          </m:rPr>
+          <m:t>=</m:t>
+        </m:r>
+        <m:sSub>
+          <m:e>
+            <m:r>
+              <m:t>x</m:t>
+            </m:r>
+          </m:e>
+          <m:sub>
+            <m:r>
+              <m:t>2</m:t>
+            </m:r>
+          </m:sub>
+        </m:sSub>
+        <m:r>
+          <m:rPr>
+            <m:sty m:val="p"/>
+          </m:rPr>
+          <m:t>=</m:t>
+        </m:r>
+        <m:r>
+          <m:t>0</m:t>
+        </m:r>
+      </m:oMath>
+      <w:r>
+        <w:t xml:space="preserve">.</w:t>
+      </w:r>
+      <w:r>
+        <w:t xml:space="preserve"> </w:t>
+      </w:r>
+      <w:r>
+        <w:t xml:space="preserve">It is invertible, with</w:t>
+      </w:r>
+      <w:r>
+        <w:t xml:space="preserve"> </w:t>
+      </w:r>
+      <m:oMath>
+        <m:sSup>
+          <m:e>
+            <m:r>
+              <m:t>​</m:t>
+            </m:r>
+            <m:d>
+              <m:dPr>
+                <m:begChr m:val="("/>
+                <m:sepChr m:val=""/>
+                <m:endChr m:val=")"/>
+                <m:grow/>
+              </m:dPr>
+              <m:e>
+                <m:r>
+                  <m:rPr>
+                    <m:sty m:val="bi"/>
+                  </m:rPr>
+                  <m:t>A</m:t>
+                </m:r>
+              </m:e>
+            </m:d>
+            <m:r>
+              <m:t>​</m:t>
+            </m:r>
+          </m:e>
+          <m:sup>
+            <m:r>
+              <m:rPr>
+                <m:sty m:val="p"/>
+              </m:rPr>
+              <m:t>−</m:t>
+            </m:r>
+            <m:r>
+              <m:t>1</m:t>
+            </m:r>
+          </m:sup>
+        </m:sSup>
+        <m:r>
+          <m:rPr>
+            <m:sty m:val="p"/>
+          </m:rPr>
+          <m:t>=</m:t>
+        </m:r>
+        <m:f>
+          <m:fPr>
+            <m:type m:val="bar"/>
+          </m:fPr>
+          <m:num>
+            <m:r>
+              <m:t>1</m:t>
+            </m:r>
+          </m:num>
+          <m:den>
+            <m:r>
+              <m:t>3</m:t>
+            </m:r>
+          </m:den>
+        </m:f>
+        <m:d>
+          <m:dPr>
+            <m:begChr m:val="["/>
+            <m:sepChr m:val=""/>
+            <m:endChr m:val="]"/>
+            <m:grow/>
+          </m:dPr>
+          <m:e>
+            <m:m>
+              <m:mPr>
+                <m:baseJc m:val="center"/>
+                <m:plcHide m:val="on"/>
+                <m:mcs>
+                  <m:mc>
+                    <m:mcPr>
+                      <m:mcJc m:val="center"/>
+                      <m:count m:val="1"/>
+                    </m:mcPr>
+                  </m:mc>
+                  <m:mc>
+                    <m:mcPr>
+                      <m:mcJc m:val="center"/>
+                      <m:count m:val="1"/>
+                    </m:mcPr>
+                  </m:mc>
+                </m:mcs>
+              </m:mPr>
+              <m:mr>
+                <m:e>
+                  <m:r>
+                    <m:t>2</m:t>
+                  </m:r>
+                </m:e>
+                <m:e>
+                  <m:r>
+                    <m:rPr>
+                      <m:sty m:val="p"/>
+                    </m:rPr>
+                    <m:t>−</m:t>
+                  </m:r>
+                  <m:r>
+                    <m:t>1</m:t>
+                  </m:r>
+                </m:e>
+              </m:mr>
+              <m:mr>
+                <m:e>
+                  <m:r>
+                    <m:rPr>
+                      <m:sty m:val="p"/>
+                    </m:rPr>
+                    <m:t>−</m:t>
+                  </m:r>
+                  <m:r>
+                    <m:t>1</m:t>
+                  </m:r>
+                </m:e>
+                <m:e>
+                  <m:r>
+                    <m:t>2</m:t>
+                  </m:r>
+                </m:e>
+              </m:mr>
+            </m:m>
+          </m:e>
+        </m:d>
+      </m:oMath>
+      <w:r>
+        <w:t xml:space="preserve">.</w:t>
+      </w:r>
+    </w:p>
+    <w:p>
+      <w:pPr>
+        <w:pStyle w:val="BodyText"/>
+      </w:pPr>
+      <w:r>
+        <w:t xml:space="preserve">The converse fails.</w:t>
+      </w:r>
+      <w:r>
+        <w:t xml:space="preserve"> </w:t>
+      </w:r>
+      <m:oMath>
+        <m:r>
+          <m:rPr>
+            <m:sty m:val="bi"/>
+          </m:rPr>
+          <m:t>D</m:t>
+        </m:r>
+        <m:r>
+          <m:rPr>
+            <m:sty m:val="p"/>
+          </m:rPr>
+          <m:t>=</m:t>
+        </m:r>
+        <m:d>
+          <m:dPr>
+            <m:begChr m:val="["/>
+            <m:sepChr m:val=""/>
+            <m:endChr m:val="]"/>
+            <m:grow/>
+          </m:dPr>
+          <m:e>
+            <m:m>
+              <m:mPr>
+                <m:baseJc m:val="center"/>
+                <m:plcHide m:val="on"/>
+                <m:mcs>
+                  <m:mc>
+                    <m:mcPr>
+                      <m:mcJc m:val="center"/>
+                      <m:count m:val="1"/>
+                    </m:mcPr>
+                  </m:mc>
+                  <m:mc>
+                    <m:mcPr>
+                      <m:mcJc m:val="center"/>
+                      <m:count m:val="1"/>
+                    </m:mcPr>
+                  </m:mc>
+                </m:mcs>
+              </m:mPr>
+              <m:mr>
+                <m:e>
+                  <m:r>
+                    <m:t>1</m:t>
+                  </m:r>
+                </m:e>
+                <m:e>
+                  <m:r>
+                    <m:t>2</m:t>
+                  </m:r>
+                </m:e>
+              </m:mr>
+              <m:mr>
+                <m:e>
+                  <m:r>
+                    <m:t>2</m:t>
+                  </m:r>
+                </m:e>
+                <m:e>
+                  <m:r>
+                    <m:t>1</m:t>
+                  </m:r>
+                </m:e>
+              </m:mr>
+            </m:m>
+          </m:e>
+        </m:d>
+      </m:oMath>
+      <w:r>
+        <w:t xml:space="preserve"> </w:t>
+      </w:r>
+      <w:r>
+        <w:t xml:space="preserve">of</w:t>
+      </w:r>
+      <w:r>
+        <w:t xml:space="preserve"> </w:t>
+      </w:r>
+      <w:hyperlink r:id="rId91">
+        <w:r>
+          <w:rPr>
+            <w:rStyle w:val="Hyperlink"/>
+          </w:rPr>
+          <w:t xml:space="preserve">Example 30 in Special Matrices and Decompositions</w:t>
+        </w:r>
+      </w:hyperlink>
+      <w:r>
+        <w:t xml:space="preserve"> </w:t>
+      </w:r>
+      <w:r>
+        <w:t xml:space="preserve">is not positive definite,</w:t>
+      </w:r>
+      <w:r>
+        <w:t xml:space="preserve"> </w:t>
+      </w:r>
+      <w:r>
+        <w:t xml:space="preserve">yet it is invertible:</w:t>
+      </w:r>
+      <w:r>
+        <w:t xml:space="preserve"> </w:t>
+      </w:r>
+      <m:oMath>
+        <m:sSup>
+          <m:e>
+            <m:r>
+              <m:t>​</m:t>
+            </m:r>
+            <m:d>
+              <m:dPr>
+                <m:begChr m:val="("/>
+                <m:sepChr m:val=""/>
+                <m:endChr m:val=")"/>
+                <m:grow/>
+              </m:dPr>
+              <m:e>
+                <m:r>
+                  <m:rPr>
+                    <m:sty m:val="bi"/>
+                  </m:rPr>
+                  <m:t>D</m:t>
+                </m:r>
+              </m:e>
+            </m:d>
+            <m:r>
+              <m:t>​</m:t>
+            </m:r>
+          </m:e>
+          <m:sup>
+            <m:r>
+              <m:rPr>
+                <m:sty m:val="p"/>
+              </m:rPr>
+              <m:t>−</m:t>
+            </m:r>
+            <m:r>
+              <m:t>1</m:t>
+            </m:r>
+          </m:sup>
+        </m:sSup>
+        <m:r>
+          <m:rPr>
+            <m:sty m:val="p"/>
+          </m:rPr>
+          <m:t>=</m:t>
+        </m:r>
+        <m:f>
+          <m:fPr>
+            <m:type m:val="bar"/>
+          </m:fPr>
+          <m:num>
+            <m:r>
+              <m:t>1</m:t>
+            </m:r>
+          </m:num>
+          <m:den>
+            <m:r>
+              <m:t>3</m:t>
+            </m:r>
+          </m:den>
+        </m:f>
+        <m:d>
+          <m:dPr>
+            <m:begChr m:val="["/>
+            <m:sepChr m:val=""/>
+            <m:endChr m:val="]"/>
+            <m:grow/>
+          </m:dPr>
+          <m:e>
+            <m:m>
+              <m:mPr>
+                <m:baseJc m:val="center"/>
+                <m:plcHide m:val="on"/>
+                <m:mcs>
+                  <m:mc>
+                    <m:mcPr>
+                      <m:mcJc m:val="center"/>
+                      <m:count m:val="1"/>
+                    </m:mcPr>
+                  </m:mc>
+                  <m:mc>
+                    <m:mcPr>
+                      <m:mcJc m:val="center"/>
+                      <m:count m:val="1"/>
+                    </m:mcPr>
+                  </m:mc>
+                </m:mcs>
+              </m:mPr>
+              <m:mr>
+                <m:e>
+                  <m:r>
+                    <m:rPr>
+                      <m:sty m:val="p"/>
+                    </m:rPr>
+                    <m:t>−</m:t>
+                  </m:r>
+                  <m:r>
+                    <m:t>1</m:t>
+                  </m:r>
+                </m:e>
+                <m:e>
+                  <m:r>
+                    <m:t>2</m:t>
+                  </m:r>
+                </m:e>
+              </m:mr>
+              <m:mr>
+                <m:e>
+                  <m:r>
+                    <m:t>2</m:t>
+                  </m:r>
+                </m:e>
+                <m:e>
+                  <m:r>
+                    <m:rPr>
+                      <m:sty m:val="p"/>
+                    </m:rPr>
+                    <m:t>−</m:t>
+                  </m:r>
+                  <m:r>
+                    <m:t>1</m:t>
+                  </m:r>
+                </m:e>
+              </m:mr>
+            </m:m>
+          </m:e>
+        </m:d>
+      </m:oMath>
+      <w:r>
+        <w:t xml:space="preserve">.</w:t>
+      </w:r>
+    </w:p>
+    <w:bookmarkEnd w:id="100"/>
+    <w:bookmarkStart w:id="101" w:name="thm-psd-plus-multiple-identity"/>
+    <w:p>
+      <w:pPr>
+        <w:pStyle w:val="BodyText"/>
+      </w:pPr>
+      <w:r>
+        <w:rPr>
+          <w:b/>
+          <w:bCs/>
+        </w:rPr>
+        <w:t xml:space="preserve">Theorem 13 (Adding a positive multiple of the identity makes a matrix positive definite)</w:t>
+      </w:r>
+      <w:r>
+        <w:t xml:space="preserve"> </w:t>
+      </w:r>
+      <w:r>
+        <w:t xml:space="preserve">Let</w:t>
+      </w:r>
+      <w:r>
+        <w:t xml:space="preserve"> </w:t>
+      </w:r>
+      <m:oMath>
+        <m:r>
+          <m:rPr>
+            <m:sty m:val="bi"/>
+          </m:rPr>
+          <m:t>A</m:t>
+        </m:r>
+      </m:oMath>
+      <w:r>
+        <w:t xml:space="preserve"> </w:t>
+      </w:r>
+      <w:r>
+        <w:t xml:space="preserve">be a</w:t>
+      </w:r>
+      <w:r>
+        <w:t xml:space="preserve"> </w:t>
+      </w:r>
+      <m:oMath>
+        <m:r>
+          <m:t>p</m:t>
+        </m:r>
+        <m:r>
+          <m:rPr>
+            <m:sty m:val="p"/>
+          </m:rPr>
+          <m:t>×</m:t>
+        </m:r>
+        <m:r>
+          <m:t>p</m:t>
+        </m:r>
+      </m:oMath>
+      <w:r>
+        <w:t xml:space="preserve"> </w:t>
+      </w:r>
+      <w:r>
+        <w:t xml:space="preserve">positive semidefinite matrix (</w:t>
+      </w:r>
+      <w:hyperlink r:id="rId83">
+        <w:r>
+          <w:rPr>
+            <w:rStyle w:val="Hyperlink"/>
+          </w:rPr>
+          <w:t xml:space="preserve">Definition 21 in Special Matrices and Decompositions</w:t>
+        </w:r>
+      </w:hyperlink>
+      <w:r>
+        <w:t xml:space="preserve">)</w:t>
+      </w:r>
+      <w:r>
+        <w:t xml:space="preserve"> </w:t>
+      </w:r>
+      <w:r>
+        <w:t xml:space="preserve">and let</w:t>
+      </w:r>
+      <w:r>
+        <w:t xml:space="preserve"> </w:t>
+      </w:r>
+      <m:oMath>
+        <m:r>
+          <m:t>α</m:t>
+        </m:r>
+        <m:r>
+          <m:rPr>
+            <m:sty m:val="p"/>
+          </m:rPr>
+          <m:t>&gt;</m:t>
+        </m:r>
+        <m:r>
+          <m:t>0</m:t>
+        </m:r>
+      </m:oMath>
+      <w:r>
+        <w:t xml:space="preserve">.</w:t>
+      </w:r>
+      <w:r>
+        <w:t xml:space="preserve"> </w:t>
+      </w:r>
+      <w:r>
+        <w:t xml:space="preserve">Then</w:t>
+      </w:r>
+      <w:r>
+        <w:t xml:space="preserve"> </w:t>
+      </w:r>
+      <m:oMath>
+        <m:r>
+          <m:rPr>
+            <m:sty m:val="bi"/>
+          </m:rPr>
+          <m:t>A</m:t>
+        </m:r>
+        <m:r>
+          <m:rPr>
+            <m:sty m:val="p"/>
+          </m:rPr>
+          <m:t>+</m:t>
+        </m:r>
+        <m:r>
+          <m:t>α</m:t>
+        </m:r>
+        <m:sSub>
+          <m:e>
+            <m:r>
+              <m:rPr>
+                <m:sty m:val="bi"/>
+              </m:rPr>
+              <m:t>I</m:t>
+            </m:r>
+          </m:e>
+          <m:sub>
+            <m:r>
+              <m:t>p</m:t>
+            </m:r>
+          </m:sub>
+        </m:sSub>
+      </m:oMath>
+      <w:r>
+        <w:t xml:space="preserve"> </w:t>
+      </w:r>
+      <w:r>
+        <w:t xml:space="preserve">is positive definite (</w:t>
+      </w:r>
+      <w:hyperlink r:id="rId84">
+        <w:r>
+          <w:rPr>
+            <w:rStyle w:val="Hyperlink"/>
+          </w:rPr>
+          <w:t xml:space="preserve">Definition 22 in Special Matrices and Decompositions</w:t>
+        </w:r>
+      </w:hyperlink>
+      <w:r>
+        <w:t xml:space="preserve">),</w:t>
+      </w:r>
+      <w:r>
+        <w:t xml:space="preserve"> </w:t>
+      </w:r>
+      <w:r>
+        <w:t xml:space="preserve">so it is invertible (</w:t>
+      </w:r>
+      <w:hyperlink w:anchor="thm-pd-invertible">
+        <w:r>
+          <w:rPr>
+            <w:rStyle w:val="Hyperlink"/>
+          </w:rPr>
+          <w:t xml:space="preserve">Theorem 12</w:t>
+        </w:r>
+      </w:hyperlink>
+      <w:r>
+        <w:t xml:space="preserve">).</w:t>
+      </w:r>
+    </w:p>
+    <w:bookmarkEnd w:id="101"/>
+    <w:p>
+      <w:pPr>
+        <w:pStyle w:val="BodyText"/>
+      </w:pPr>
+      <w:r>
+        <w:rPr>
+          <w:i/>
+          <w:iCs/>
+        </w:rPr>
+        <w:t xml:space="preserve">Proof</w:t>
+      </w:r>
+      <w:r>
+        <w:t xml:space="preserve">. </w:t>
+      </w:r>
+      <m:oMath>
+        <m:r>
+          <m:rPr>
+            <m:sty m:val="bi"/>
+          </m:rPr>
+          <m:t>A</m:t>
+        </m:r>
+        <m:r>
+          <m:rPr>
+            <m:sty m:val="p"/>
+          </m:rPr>
+          <m:t>+</m:t>
+        </m:r>
+        <m:r>
+          <m:t>α</m:t>
+        </m:r>
+        <m:sSub>
+          <m:e>
+            <m:r>
+              <m:rPr>
+                <m:sty m:val="bi"/>
+              </m:rPr>
+              <m:t>I</m:t>
+            </m:r>
+          </m:e>
+          <m:sub>
+            <m:r>
+              <m:t>p</m:t>
+            </m:r>
+          </m:sub>
+        </m:sSub>
+      </m:oMath>
+      <w:r>
+        <w:t xml:space="preserve"> </w:t>
+      </w:r>
+      <w:r>
+        <w:t xml:space="preserve">is symmetric:</w:t>
+      </w:r>
+      <w:r>
+        <w:t xml:space="preserve"> </w:t>
+      </w:r>
+      <w:r>
+        <w:t xml:space="preserve">its transpose is</w:t>
+      </w:r>
+      <w:r>
+        <w:t xml:space="preserve"> </w:t>
+      </w:r>
+      <m:oMath>
+        <m:sSup>
+          <m:e>
+            <m:r>
+              <m:rPr>
+                <m:sty m:val="bi"/>
+              </m:rPr>
+              <m:t>A</m:t>
+            </m:r>
+          </m:e>
+          <m:sup>
+            <m:r>
+              <m:rPr>
+                <m:sty m:val="p"/>
+              </m:rPr>
+              <m:t>⊤</m:t>
+            </m:r>
+          </m:sup>
+        </m:sSup>
+        <m:r>
+          <m:rPr>
+            <m:sty m:val="p"/>
+          </m:rPr>
+          <m:t>+</m:t>
+        </m:r>
+        <m:r>
+          <m:t>α</m:t>
+        </m:r>
+        <m:sSub>
+          <m:e>
+            <m:r>
+              <m:rPr>
+                <m:sty m:val="bi"/>
+              </m:rPr>
+              <m:t>I</m:t>
+            </m:r>
+          </m:e>
+          <m:sub>
+            <m:r>
+              <m:t>p</m:t>
+            </m:r>
+          </m:sub>
+        </m:sSub>
+        <m:r>
+          <m:rPr>
+            <m:sty m:val="p"/>
+          </m:rPr>
+          <m:t>=</m:t>
+        </m:r>
+        <m:r>
+          <m:rPr>
+            <m:sty m:val="bi"/>
+          </m:rPr>
+          <m:t>A</m:t>
+        </m:r>
+        <m:r>
+          <m:rPr>
+            <m:sty m:val="p"/>
+          </m:rPr>
+          <m:t>+</m:t>
+        </m:r>
+        <m:r>
+          <m:t>α</m:t>
+        </m:r>
+        <m:sSub>
+          <m:e>
+            <m:r>
+              <m:rPr>
+                <m:sty m:val="bi"/>
+              </m:rPr>
+              <m:t>I</m:t>
+            </m:r>
+          </m:e>
+          <m:sub>
+            <m:r>
+              <m:t>p</m:t>
+            </m:r>
+          </m:sub>
+        </m:sSub>
+      </m:oMath>
+      <w:r>
+        <w:t xml:space="preserve"> </w:t>
+      </w:r>
+      <w:r>
+        <w:t xml:space="preserve">(</w:t>
+      </w:r>
+      <w:hyperlink r:id="rId96">
+        <w:r>
+          <w:rPr>
+            <w:rStyle w:val="Hyperlink"/>
+          </w:rPr>
+          <w:t xml:space="preserve">Theorem 15 in Matrices</w:t>
+        </w:r>
+      </w:hyperlink>
+      <w:r>
+        <w:t xml:space="preserve">,</w:t>
+      </w:r>
+      <w:r>
+        <w:t xml:space="preserve"> </w:t>
+      </w:r>
+      <w:hyperlink r:id="rId97">
+        <w:r>
+          <w:rPr>
+            <w:rStyle w:val="Hyperlink"/>
+          </w:rPr>
+          <w:t xml:space="preserve">Definition 6 in Matrices</w:t>
+        </w:r>
+      </w:hyperlink>
+      <w:r>
+        <w:t xml:space="preserve">,</w:t>
+      </w:r>
+      <w:r>
+        <w:t xml:space="preserve"> </w:t>
+      </w:r>
+      <w:hyperlink r:id="rId87">
+        <w:r>
+          <w:rPr>
+            <w:rStyle w:val="Hyperlink"/>
+          </w:rPr>
+          <w:t xml:space="preserve">Definition 3 in Matrices</w:t>
+        </w:r>
+      </w:hyperlink>
+      <w:r>
+        <w:t xml:space="preserve">).</w:t>
+      </w:r>
+      <w:r>
+        <w:t xml:space="preserve"> </w:t>
+      </w:r>
+      <w:r>
+        <w:t xml:space="preserve">For</w:t>
+      </w:r>
+      <w:r>
+        <w:t xml:space="preserve"> </w:t>
+      </w:r>
+      <w:r>
+        <w:t xml:space="preserve">$\mathord{\smash[b]{\underset{\raise.3ex\hbox{$\scriptstyle\sim$}}{x}}\vphantom{x}}\ne \mathord{\smash[b]{\underset{\raise.3ex\hbox{$\scriptstyle\sim$}}{0}}\vphantom{0}}_p$</w:t>
+      </w:r>
+      <w:r>
+        <w:t xml:space="preserve">,</w:t>
+      </w:r>
+    </w:p>
+    <w:p>
+      <w:pPr>
+        <w:pStyle w:val="BodyText"/>
+      </w:pPr>
+      <w:r>
+        <w:t xml:space="preserve">$$
+    \begin{aligned}
+    {\mathord{\smash[b]{\underset{\raise.3ex\hbox{$\scriptstyle\sim$}}{x}}\vphantom{x}}}^{\top}\,(\mathbf{A} + \alpha\mathbf{I}_p)\,\mathord{\smash[b]{\underset{\raise.3ex\hbox{$\scriptstyle\sim$}}{x}}\vphantom{x}}
+    &amp;= {\mathord{\smash[b]{\underset{\raise.3ex\hbox{$\scriptstyle\sim$}}{x}}\vphantom{x}}}^{\top} \mathbf{A} \mathord{\smash[b]{\underset{\raise.3ex\hbox{$\scriptstyle\sim$}}{x}}\vphantom{x}} + \alpha\,{\mathord{\smash[b]{\underset{\raise.3ex\hbox{$\scriptstyle\sim$}}{x}}\vphantom{x}}}^{\top}\,\mathbf{I}_p\,\mathord{\smash[b]{\underset{\raise.3ex\hbox{$\scriptstyle\sim$}}{x}}\vphantom{x}}
+    &amp;&amp; \text{(}\text{Theorem~6 in Matrices}\text{, }\text{Theorem~7 in Projections and Linear Systems}\text{)}
+    \\
+    &amp;= {\mathord{\smash[b]{\underset{\raise.3ex\hbox{$\scriptstyle\sim$}}{x}}\vphantom{x}}}^{\top} \mathbf{A} \mathord{\smash[b]{\underset{\raise.3ex\hbox{$\scriptstyle\sim$}}{x}}\vphantom{x}} + \alpha\,\mathopen{}\left\lVert\mathord{\smash[b]{\underset{\raise.3ex\hbox{$\scriptstyle\sim$}}{x}}\vphantom{x}}\right\rVert\mathclose{}^2
+    &amp;&amp; \text{(}\text{Theorem~7 in Matrices}\text{, }\text{Equation~2 in Vectors}\text{, squared)}
+    \\
+    &amp;&gt; 0.
+    &amp;&amp; \text{(} {\mathord{\smash[b]{\underset{\raise.3ex\hbox{$\scriptstyle\sim$}}{x}}\vphantom{x}}}^{\top} \mathbf{A} \mathord{\smash[b]{\underset{\raise.3ex\hbox{$\scriptstyle\sim$}}{x}}\vphantom{x}} \ge 0, \; \alpha&gt; 0, \; \mathord{\smash[b]{\underset{\raise.3ex\hbox{$\scriptstyle\sim$}}{x}}\vphantom{x}}\ne \mathord{\smash[b]{\underset{\raise.3ex\hbox{$\scriptstyle\sim$}}{0}}\vphantom{0}}_p \text{)}
+    \end{aligned}
+    $$</w:t>
+      </w:r>
+    </w:p>
+    <w:bookmarkStart w:id="102" w:name="exm-psd-plus-multiple-identity"/>
+    <w:p>
+      <w:pPr>
+        <w:pStyle w:val="FirstParagraph"/>
+      </w:pPr>
+      <w:r>
+        <w:rPr>
+          <w:b/>
+          <w:bCs/>
+        </w:rPr>
+        <w:t xml:space="preserve">Example 18 (Repairing a singular matrix)</w:t>
+      </w:r>
+      <w:r>
+        <w:t xml:space="preserve"> </w:t>
+      </w:r>
+      <m:oMath>
+        <m:r>
+          <m:rPr>
+            <m:sty m:val="bi"/>
+          </m:rPr>
+          <m:t>B</m:t>
+        </m:r>
+        <m:r>
+          <m:rPr>
+            <m:sty m:val="p"/>
+          </m:rPr>
+          <m:t>=</m:t>
+        </m:r>
+        <m:d>
+          <m:dPr>
+            <m:begChr m:val="["/>
+            <m:sepChr m:val=""/>
+            <m:endChr m:val="]"/>
+            <m:grow/>
+          </m:dPr>
+          <m:e>
+            <m:m>
+              <m:mPr>
+                <m:baseJc m:val="center"/>
+                <m:plcHide m:val="on"/>
+                <m:mcs>
+                  <m:mc>
+                    <m:mcPr>
+                      <m:mcJc m:val="center"/>
+                      <m:count m:val="1"/>
+                    </m:mcPr>
+                  </m:mc>
+                  <m:mc>
+                    <m:mcPr>
+                      <m:mcJc m:val="center"/>
+                      <m:count m:val="1"/>
+                    </m:mcPr>
+                  </m:mc>
+                </m:mcs>
+              </m:mPr>
+              <m:mr>
+                <m:e>
+                  <m:r>
+                    <m:t>1</m:t>
+                  </m:r>
+                </m:e>
+                <m:e>
+                  <m:r>
+                    <m:t>1</m:t>
+                  </m:r>
+                </m:e>
+              </m:mr>
+              <m:mr>
+                <m:e>
+                  <m:r>
+                    <m:t>1</m:t>
+                  </m:r>
+                </m:e>
+                <m:e>
+                  <m:r>
+                    <m:t>1</m:t>
+                  </m:r>
+                </m:e>
+              </m:mr>
+            </m:m>
+          </m:e>
+        </m:d>
+      </m:oMath>
+      <w:r>
+        <w:t xml:space="preserve"> </w:t>
+      </w:r>
+      <w:r>
+        <w:t xml:space="preserve">of</w:t>
+      </w:r>
+      <w:r>
+        <w:t xml:space="preserve"> </w:t>
+      </w:r>
+      <w:hyperlink r:id="rId90">
+        <w:r>
+          <w:rPr>
+            <w:rStyle w:val="Hyperlink"/>
+          </w:rPr>
+          <w:t xml:space="preserve">Example 29 in Special Matrices and Decompositions</w:t>
+        </w:r>
+      </w:hyperlink>
+      <w:r>
+        <w:t xml:space="preserve"> </w:t>
+      </w:r>
+      <w:r>
+        <w:t xml:space="preserve">is positive semidefinite and singular:</w:t>
+      </w:r>
+      <w:r>
+        <w:t xml:space="preserve"> </w:t>
+      </w:r>
+      <w:r>
+        <w:t xml:space="preserve">$\mathbf{B} (1, -1) = \mathord{\smash[b]{\underset{\raise.3ex\hbox{$\scriptstyle\sim$}}{0}}\vphantom{0}}_2$</w:t>
+      </w:r>
+      <w:r>
+        <w:t xml:space="preserve">.</w:t>
+      </w:r>
+      <w:r>
+        <w:t xml:space="preserve"> </w:t>
+      </w:r>
+      <w:r>
+        <w:t xml:space="preserve">With</w:t>
+      </w:r>
+      <w:r>
+        <w:t xml:space="preserve"> </w:t>
+      </w:r>
+      <m:oMath>
+        <m:r>
+          <m:t>α</m:t>
+        </m:r>
+        <m:r>
+          <m:rPr>
+            <m:sty m:val="p"/>
+          </m:rPr>
+          <m:t>=</m:t>
+        </m:r>
+        <m:r>
+          <m:t>1</m:t>
+        </m:r>
+      </m:oMath>
+      <w:r>
+        <w:t xml:space="preserve">,</w:t>
+      </w:r>
+    </w:p>
+    <w:p>
+      <w:pPr>
+        <w:pStyle w:val="BodyText"/>
+      </w:pPr>
+      <m:oMathPara>
+        <m:oMathParaPr>
+          <m:jc m:val="center"/>
+        </m:oMathParaPr>
+        <m:oMath>
+          <m:r>
+            <m:rPr>
+              <m:sty m:val="bi"/>
+            </m:rPr>
+            <m:t>B</m:t>
+          </m:r>
+          <m:r>
+            <m:rPr>
+              <m:sty m:val="p"/>
+            </m:rPr>
+            <m:t>+</m:t>
+          </m:r>
+          <m:sSub>
+            <m:e>
+              <m:r>
+                <m:rPr>
+                  <m:sty m:val="bi"/>
+                </m:rPr>
+                <m:t>I</m:t>
+              </m:r>
+            </m:e>
+            <m:sub>
+              <m:r>
+                <m:t>2</m:t>
+              </m:r>
+            </m:sub>
+          </m:sSub>
+          <m:r>
+            <m:rPr>
+              <m:sty m:val="p"/>
+            </m:rPr>
+            <m:t>=</m:t>
+          </m:r>
+          <m:d>
+            <m:dPr>
+              <m:begChr m:val="["/>
+              <m:sepChr m:val=""/>
+              <m:endChr m:val="]"/>
+              <m:grow/>
+            </m:dPr>
+            <m:e>
+              <m:m>
+                <m:mPr>
+                  <m:baseJc m:val="center"/>
+                  <m:plcHide m:val="on"/>
+                  <m:mcs>
+                    <m:mc>
+                      <m:mcPr>
+                        <m:mcJc m:val="center"/>
+                        <m:count m:val="1"/>
+                      </m:mcPr>
+                    </m:mc>
+                    <m:mc>
+                      <m:mcPr>
+                        <m:mcJc m:val="center"/>
+                        <m:count m:val="1"/>
+                      </m:mcPr>
+                    </m:mc>
+                  </m:mcs>
+                </m:mPr>
+                <m:mr>
+                  <m:e>
+                    <m:r>
+                      <m:t>2</m:t>
+                    </m:r>
+                  </m:e>
+                  <m:e>
+                    <m:r>
+                      <m:t>1</m:t>
+                    </m:r>
+                  </m:e>
+                </m:mr>
+                <m:mr>
+                  <m:e>
+                    <m:r>
+                      <m:t>1</m:t>
+                    </m:r>
+                  </m:e>
+                  <m:e>
+                    <m:r>
+                      <m:t>2</m:t>
+                    </m:r>
+                  </m:e>
+                </m:mr>
+              </m:m>
+            </m:e>
+          </m:d>
+          <m:r>
+            <m:rPr>
+              <m:sty m:val="p"/>
+            </m:rPr>
+            <m:t>,</m:t>
+          </m:r>
+        </m:oMath>
+      </m:oMathPara>
+    </w:p>
+    <w:p>
+      <w:pPr>
+        <w:pStyle w:val="FirstParagraph"/>
+      </w:pPr>
+      <w:r>
+        <w:t xml:space="preserve">which is positive definite and invertible by</w:t>
+      </w:r>
+      <w:r>
+        <w:t xml:space="preserve"> </w:t>
+      </w:r>
+      <w:hyperlink w:anchor="exm-pd-invertible">
+        <w:r>
+          <w:rPr>
+            <w:rStyle w:val="Hyperlink"/>
+          </w:rPr>
+          <w:t xml:space="preserve">Example 17</w:t>
+        </w:r>
+      </w:hyperlink>
+      <w:r>
+        <w:t xml:space="preserve">.</w:t>
+      </w:r>
+    </w:p>
+    <w:bookmarkEnd w:id="102"/>
+    <w:bookmarkStart w:id="103" w:name="cor-gram-invertible-iff"/>
+    <w:p>
+      <w:pPr>
+        <w:pStyle w:val="BodyText"/>
+      </w:pPr>
+      <w:r>
+        <w:rPr>
+          <w:b/>
+          <w:bCs/>
+        </w:rPr>
+        <w:t xml:space="preserve">Corollary 2 (</w:t>
+      </w:r>
+      <m:oMath>
+        <m:sSup>
+          <m:e>
+            <m:r>
+              <m:rPr>
+                <m:sty m:val="bi"/>
+              </m:rPr>
+              <m:t>X</m:t>
+            </m:r>
+          </m:e>
+          <m:sup>
+            <m:r>
+              <m:rPr>
+                <m:sty m:val="p"/>
+              </m:rPr>
+              <m:t>⊤</m:t>
+            </m:r>
+          </m:sup>
+        </m:sSup>
+        <m:r>
+          <m:rPr>
+            <m:sty m:val="bi"/>
+          </m:rPr>
+          <m:t>X</m:t>
+        </m:r>
+      </m:oMath>
+      <w:r>
+        <w:rPr>
+          <w:b/>
+          <w:bCs/>
+        </w:rPr>
+        <w:t xml:space="preserve"> </w:t>
+      </w:r>
+      <w:r>
+        <w:rPr>
+          <w:b/>
+          <w:bCs/>
+        </w:rPr>
+        <w:t xml:space="preserve">is invertible exactly when</w:t>
+      </w:r>
+      <w:r>
+        <w:rPr>
+          <w:b/>
+          <w:bCs/>
+        </w:rPr>
+        <w:t xml:space="preserve"> </w:t>
+      </w:r>
+      <m:oMath>
+        <m:r>
+          <m:rPr>
+            <m:sty m:val="bi"/>
+          </m:rPr>
+          <m:t>X</m:t>
+        </m:r>
+      </m:oMath>
+      <w:r>
+        <w:rPr>
+          <w:b/>
+          <w:bCs/>
+        </w:rPr>
+        <w:t xml:space="preserve"> </w:t>
+      </w:r>
+      <w:r>
+        <w:rPr>
+          <w:b/>
+          <w:bCs/>
+        </w:rPr>
+        <w:t xml:space="preserve">has full column rank)</w:t>
+      </w:r>
+      <w:r>
+        <w:t xml:space="preserve"> </w:t>
+      </w:r>
+      <w:r>
+        <w:t xml:space="preserve">For an</w:t>
+      </w:r>
+      <w:r>
+        <w:t xml:space="preserve"> </w:t>
+      </w:r>
+      <m:oMath>
+        <m:r>
+          <m:t>n</m:t>
+        </m:r>
+        <m:r>
+          <m:rPr>
+            <m:sty m:val="p"/>
+          </m:rPr>
+          <m:t>×</m:t>
+        </m:r>
+        <m:r>
+          <m:t>p</m:t>
+        </m:r>
+      </m:oMath>
+      <w:r>
+        <w:t xml:space="preserve"> </w:t>
+      </w:r>
+      <w:r>
+        <w:t xml:space="preserve">matrix</w:t>
+      </w:r>
+      <w:r>
+        <w:t xml:space="preserve"> </w:t>
+      </w:r>
+      <m:oMath>
+        <m:r>
+          <m:rPr>
+            <m:sty m:val="bi"/>
+          </m:rPr>
+          <m:t>X</m:t>
+        </m:r>
+      </m:oMath>
+      <w:r>
+        <w:t xml:space="preserve">, the</w:t>
+      </w:r>
+      <w:r>
+        <w:t xml:space="preserve"> </w:t>
+      </w:r>
+      <m:oMath>
+        <m:r>
+          <m:t>p</m:t>
+        </m:r>
+        <m:r>
+          <m:rPr>
+            <m:sty m:val="p"/>
+          </m:rPr>
+          <m:t>×</m:t>
+        </m:r>
+        <m:r>
+          <m:t>p</m:t>
+        </m:r>
+      </m:oMath>
+      <w:r>
+        <w:t xml:space="preserve"> </w:t>
+      </w:r>
+      <w:r>
+        <w:t xml:space="preserve">matrix</w:t>
+      </w:r>
+      <w:r>
+        <w:t xml:space="preserve"> </w:t>
+      </w:r>
+      <m:oMath>
+        <m:sSup>
+          <m:e>
+            <m:r>
+              <m:rPr>
+                <m:sty m:val="bi"/>
+              </m:rPr>
+              <m:t>X</m:t>
+            </m:r>
+          </m:e>
+          <m:sup>
+            <m:r>
+              <m:rPr>
+                <m:sty m:val="p"/>
+              </m:rPr>
+              <m:t>⊤</m:t>
+            </m:r>
+          </m:sup>
+        </m:sSup>
+        <m:r>
+          <m:rPr>
+            <m:sty m:val="bi"/>
+          </m:rPr>
+          <m:t>X</m:t>
+        </m:r>
+      </m:oMath>
+      <w:r>
+        <w:t xml:space="preserve"> </w:t>
+      </w:r>
+      <w:r>
+        <w:t xml:space="preserve">is invertible (</w:t>
+      </w:r>
+      <w:hyperlink r:id="rId15">
+        <w:r>
+          <w:rPr>
+            <w:rStyle w:val="Hyperlink"/>
+          </w:rPr>
+          <w:t xml:space="preserve">Definition 6 in Special Matrices and Decompositions</w:t>
+        </w:r>
+      </w:hyperlink>
+      <w:r>
+        <w:t xml:space="preserve">)</w:t>
+      </w:r>
+      <w:r>
+        <w:t xml:space="preserve"> </w:t>
+      </w:r>
+      <w:r>
+        <w:t xml:space="preserve">exactly when</w:t>
+      </w:r>
+      <w:r>
+        <w:t xml:space="preserve"> </w:t>
+      </w:r>
+      <m:oMath>
+        <m:r>
+          <m:rPr>
+            <m:sty m:val="p"/>
+          </m:rPr>
+          <m:t>rank</m:t>
+        </m:r>
+        <m:r>
+          <m:rPr>
+            <m:sty m:val="p"/>
+          </m:rPr>
+          <m:t>(</m:t>
+        </m:r>
+        <m:r>
+          <m:rPr>
+            <m:sty m:val="bi"/>
+          </m:rPr>
+          <m:t>X</m:t>
+        </m:r>
+        <m:r>
+          <m:rPr>
+            <m:sty m:val="p"/>
+          </m:rPr>
+          <m:t>)</m:t>
+        </m:r>
+        <m:r>
+          <m:rPr>
+            <m:sty m:val="p"/>
+          </m:rPr>
+          <m:t>=</m:t>
+        </m:r>
+        <m:r>
+          <m:t>p</m:t>
+        </m:r>
+      </m:oMath>
+      <w:r>
+        <w:t xml:space="preserve"> </w:t>
+      </w:r>
+      <w:r>
+        <w:t xml:space="preserve">(</w:t>
+      </w:r>
+      <w:hyperlink r:id="rId16">
+        <w:r>
+          <w:rPr>
+            <w:rStyle w:val="Hyperlink"/>
+          </w:rPr>
+          <w:t xml:space="preserve">Definition 3 in Subspaces and Rank</w:t>
+        </w:r>
+      </w:hyperlink>
+      <w:r>
+        <w:t xml:space="preserve">).</w:t>
+      </w:r>
+    </w:p>
+    <w:bookmarkEnd w:id="103"/>
+    <w:p>
+      <w:pPr>
+        <w:pStyle w:val="BodyText"/>
+      </w:pPr>
+      <w:r>
+        <w:rPr>
+          <w:i/>
+          <w:iCs/>
+        </w:rPr>
+        <w:t xml:space="preserve">Proof</w:t>
+      </w:r>
+      <w:r>
+        <w:t xml:space="preserve">. </w:t>
+      </w:r>
+      <w:r>
+        <w:t xml:space="preserve">The following statements are equivalent:</w:t>
+      </w:r>
+    </w:p>
+    <w:p>
+      <w:pPr>
+        <w:pStyle w:val="BodyText"/>
+      </w:pPr>
+      <w:r>
+        <w:t xml:space="preserve">$$
+    \begin{aligned}
+    {\mathbf{X}}^{\top}\mathbf{X}\text{ is invertible}
+    &amp;\iff \mathcal{N}({\mathbf{X}}^{\top}\mathbf{X}) = \mathopen{}\left\{\mathord{\smash[b]{\underset{\raise.3ex\hbox{$\scriptstyle\sim$}}{0}}\vphantom{0}}_p\right\}\mathclose{}
+    &amp;&amp; \text{(}\text{Theorem~1}\text{)}
+    \\
+    &amp;\iff \mathcal{N}(\mathbf{X}) = \mathopen{}\left\{\mathord{\smash[b]{\underset{\raise.3ex\hbox{$\scriptstyle\sim$}}{0}}\vphantom{0}}_p\right\}\mathclose{}
+    &amp;&amp; \text{(}\text{Theorem~6 in Column Space, Null Space and Rank-Nullity}\text{)}
+    \\
+    &amp;\iff \mathbf{X}\text{ has full column rank.}
+    &amp;&amp; \text{(}\text{Theorem~3 in Column Space, Null Space and Rank-Nullity}\text{)}
+    \end{aligned}
+    $$</w:t>
+      </w:r>
+    </w:p>
+    <w:bookmarkStart w:id="105" w:name="exm-gram-invertible-iff"/>
+    <w:p>
+      <w:pPr>
+        <w:pStyle w:val="FirstParagraph"/>
+      </w:pPr>
+      <w:r>
+        <w:rPr>
+          <w:b/>
+          <w:bCs/>
+        </w:rPr>
+        <w:t xml:space="preserve">Example 19 (A design matrix with a repeated column)</w:t>
+      </w:r>
+      <w:r>
+        <w:t xml:space="preserve"> </w:t>
+      </w:r>
+      <m:oMath>
+        <m:r>
+          <m:rPr>
+            <m:sty m:val="bi"/>
+          </m:rPr>
+          <m:t>X</m:t>
+        </m:r>
+        <m:r>
+          <m:rPr>
+            <m:sty m:val="p"/>
+          </m:rPr>
+          <m:t>=</m:t>
+        </m:r>
+        <m:d>
+          <m:dPr>
+            <m:begChr m:val="["/>
+            <m:sepChr m:val=""/>
+            <m:endChr m:val="]"/>
+            <m:grow/>
+          </m:dPr>
+          <m:e>
+            <m:m>
+              <m:mPr>
+                <m:baseJc m:val="center"/>
+                <m:plcHide m:val="on"/>
+                <m:mcs>
+                  <m:mc>
+                    <m:mcPr>
+                      <m:mcJc m:val="center"/>
+                      <m:count m:val="1"/>
+                    </m:mcPr>
+                  </m:mc>
+                  <m:mc>
+                    <m:mcPr>
+                      <m:mcJc m:val="center"/>
+                      <m:count m:val="1"/>
+                    </m:mcPr>
+                  </m:mc>
+                </m:mcs>
+              </m:mPr>
+              <m:mr>
+                <m:e>
+                  <m:r>
+                    <m:t>1</m:t>
+                  </m:r>
+                </m:e>
+                <m:e>
+                  <m:r>
+                    <m:t>2</m:t>
+                  </m:r>
+                </m:e>
+              </m:mr>
+              <m:mr>
+                <m:e>
+                  <m:r>
+                    <m:t>1</m:t>
+                  </m:r>
+                </m:e>
+                <m:e>
+                  <m:r>
+                    <m:t>2</m:t>
+                  </m:r>
+                </m:e>
+              </m:mr>
+              <m:mr>
+                <m:e>
+                  <m:r>
+                    <m:t>1</m:t>
+                  </m:r>
+                </m:e>
+                <m:e>
+                  <m:r>
+                    <m:t>2</m:t>
+                  </m:r>
+                </m:e>
+              </m:mr>
+            </m:m>
+          </m:e>
+        </m:d>
+      </m:oMath>
+      <w:r>
+        <w:t xml:space="preserve"> </w:t>
+      </w:r>
+      <w:r>
+        <w:t xml:space="preserve">of</w:t>
+      </w:r>
+      <w:r>
+        <w:t xml:space="preserve"> </w:t>
+      </w:r>
+      <w:hyperlink r:id="rId92">
+        <w:r>
+          <w:rPr>
+            <w:rStyle w:val="Hyperlink"/>
+          </w:rPr>
+          <w:t xml:space="preserve">Example 2 in Subspaces and Rank</w:t>
+        </w:r>
+      </w:hyperlink>
+      <w:r>
+        <w:t xml:space="preserve"> </w:t>
+      </w:r>
+      <w:r>
+        <w:t xml:space="preserve">has rank</w:t>
+      </w:r>
+      <w:r>
+        <w:t xml:space="preserve"> </w:t>
+      </w:r>
+      <m:oMath>
+        <m:r>
+          <m:t>1</m:t>
+        </m:r>
+        <m:r>
+          <m:rPr>
+            <m:sty m:val="p"/>
+          </m:rPr>
+          <m:t>&lt;</m:t>
+        </m:r>
+        <m:r>
+          <m:t>2</m:t>
+        </m:r>
+      </m:oMath>
+      <w:r>
+        <w:t xml:space="preserve">.</w:t>
+      </w:r>
+      <w:r>
+        <w:t xml:space="preserve"> </w:t>
+      </w:r>
+      <w:r>
+        <w:t xml:space="preserve">Its cross-product matrix is</w:t>
+      </w:r>
+    </w:p>
+    <w:p>
+      <w:pPr>
+        <w:pStyle w:val="BodyText"/>
+      </w:pPr>
+      <m:oMathPara>
+        <m:oMathParaPr>
+          <m:jc m:val="center"/>
+        </m:oMathParaPr>
+        <m:oMath>
+          <m:sSup>
+            <m:e>
+              <m:r>
+                <m:rPr>
+                  <m:sty m:val="bi"/>
+                </m:rPr>
+                <m:t>X</m:t>
+              </m:r>
+            </m:e>
+            <m:sup>
+              <m:r>
+                <m:rPr>
+                  <m:sty m:val="p"/>
+                </m:rPr>
+                <m:t>⊤</m:t>
+              </m:r>
+            </m:sup>
+          </m:sSup>
+          <m:r>
+            <m:rPr>
+              <m:sty m:val="bi"/>
+            </m:rPr>
+            <m:t>X</m:t>
+          </m:r>
+          <m:r>
+            <m:rPr>
+              <m:sty m:val="p"/>
+            </m:rPr>
+            <m:t>=</m:t>
+          </m:r>
+          <m:d>
+            <m:dPr>
+              <m:begChr m:val="["/>
+              <m:sepChr m:val=""/>
+              <m:endChr m:val="]"/>
+              <m:grow/>
+            </m:dPr>
+            <m:e>
+              <m:m>
+                <m:mPr>
+                  <m:baseJc m:val="center"/>
+                  <m:plcHide m:val="on"/>
+                  <m:mcs>
+                    <m:mc>
+                      <m:mcPr>
+                        <m:mcJc m:val="center"/>
+                        <m:count m:val="1"/>
+                      </m:mcPr>
+                    </m:mc>
+                    <m:mc>
+                      <m:mcPr>
+                        <m:mcJc m:val="center"/>
+                        <m:count m:val="1"/>
+                      </m:mcPr>
+                    </m:mc>
+                  </m:mcs>
+                </m:mPr>
+                <m:mr>
+                  <m:e>
+                    <m:r>
+                      <m:t>3</m:t>
+                    </m:r>
+                  </m:e>
+                  <m:e>
+                    <m:r>
+                      <m:t>6</m:t>
+                    </m:r>
+                  </m:e>
+                </m:mr>
+                <m:mr>
+                  <m:e>
+                    <m:r>
+                      <m:t>6</m:t>
+                    </m:r>
+                  </m:e>
+                  <m:e>
+                    <m:r>
+                      <m:t>12</m:t>
+                    </m:r>
+                  </m:e>
+                </m:mr>
+              </m:m>
+            </m:e>
+          </m:d>
+          <m:r>
+            <m:rPr>
+              <m:sty m:val="p"/>
+            </m:rPr>
+            <m:t>,</m:t>
+          </m:r>
+        </m:oMath>
+      </m:oMathPara>
+    </w:p>
+    <w:p>
+      <w:pPr>
+        <w:pStyle w:val="FirstParagraph"/>
+      </w:pPr>
+      <w:r>
+        <w:t xml:space="preserve">which is singular:</w:t>
+      </w:r>
+      <w:r>
+        <w:t xml:space="preserve"> </w:t>
+      </w:r>
+      <m:oMath>
+        <m:r>
+          <m:rPr>
+            <m:sty m:val="p"/>
+          </m:rPr>
+          <m:t>(</m:t>
+        </m:r>
+        <m:r>
+          <m:t>2</m:t>
+        </m:r>
+        <m:r>
+          <m:rPr>
+            <m:sty m:val="p"/>
+          </m:rPr>
+          <m:t>,</m:t>
+        </m:r>
+        <m:r>
+          <m:rPr>
+            <m:sty m:val="p"/>
+          </m:rPr>
+          <m:t>−</m:t>
+        </m:r>
+        <m:r>
+          <m:t>1</m:t>
+        </m:r>
+        <m:r>
+          <m:rPr>
+            <m:sty m:val="p"/>
+          </m:rPr>
+          <m:t>)</m:t>
+        </m:r>
+      </m:oMath>
+      <w:r>
+        <w:t xml:space="preserve"> </w:t>
+      </w:r>
+      <w:r>
+        <w:t xml:space="preserve">is in its null space,</w:t>
+      </w:r>
+      <w:r>
+        <w:t xml:space="preserve"> </w:t>
+      </w:r>
+      <w:r>
+        <w:t xml:space="preserve">because</w:t>
+      </w:r>
+      <w:r>
+        <w:t xml:space="preserve"> </w:t>
+      </w:r>
+      <w:r>
+        <w:t xml:space="preserve">$\mathbf{X}(2, -1) = \mathord{\smash[b]{\underset{\raise.3ex\hbox{$\scriptstyle\sim$}}{0}}\vphantom{0}}_3$</w:t>
+      </w:r>
+      <w:r>
+        <w:t xml:space="preserve"> </w:t>
+      </w:r>
+      <w:r>
+        <w:t xml:space="preserve">(</w:t>
+      </w:r>
+      <w:hyperlink r:id="rId104">
+        <w:r>
+          <w:rPr>
+            <w:rStyle w:val="Hyperlink"/>
+          </w:rPr>
+          <w:t xml:space="preserve">Example 5 in Column Space, Null Space and Rank-Nullity</w:t>
+        </w:r>
+      </w:hyperlink>
+      <w:r>
+        <w:t xml:space="preserve">).</w:t>
+      </w:r>
+      <w:r>
+        <w:t xml:space="preserve"> </w:t>
+      </w:r>
+      <w:r>
+        <w:t xml:space="preserve">For the full-column-rank matrix of</w:t>
+      </w:r>
+      <w:r>
+        <w:t xml:space="preserve"> </w:t>
+      </w:r>
+      <w:hyperlink r:id="rId93">
+        <w:r>
+          <w:rPr>
+            <w:rStyle w:val="Hyperlink"/>
+          </w:rPr>
+          <w:t xml:space="preserve">Example 1 in Projections and Linear Systems</w:t>
+        </w:r>
+      </w:hyperlink>
+      <w:r>
+        <w:t xml:space="preserve">,</w:t>
+      </w:r>
+      <w:r>
+        <w:t xml:space="preserve"> </w:t>
+      </w:r>
+      <m:oMath>
+        <m:sSup>
+          <m:e>
+            <m:r>
+              <m:rPr>
+                <m:sty m:val="bi"/>
+              </m:rPr>
+              <m:t>X</m:t>
+            </m:r>
+          </m:e>
+          <m:sup>
+            <m:r>
+              <m:rPr>
+                <m:sty m:val="p"/>
+              </m:rPr>
+              <m:t>⊤</m:t>
+            </m:r>
+          </m:sup>
+        </m:sSup>
+        <m:r>
+          <m:rPr>
+            <m:sty m:val="bi"/>
+          </m:rPr>
+          <m:t>X</m:t>
+        </m:r>
+      </m:oMath>
+      <w:r>
+        <w:t xml:space="preserve"> </w:t>
+      </w:r>
+      <w:r>
+        <w:t xml:space="preserve">is invertible.</w:t>
+      </w:r>
+    </w:p>
+    <w:bookmarkEnd w:id="105"/>
+    <w:bookmarkStart w:id="106" w:name="def-block-matrix"/>
+    <w:p>
+      <w:pPr>
+        <w:pStyle w:val="BodyText"/>
       </w:pPr>
       <w:r>
         <w:rPr>
@@ -30335,8 +32554,8 @@
         <w:t xml:space="preserve">.</w:t>
       </w:r>
     </w:p>
-    <w:bookmarkEnd w:id="99"/>
-    <w:bookmarkStart w:id="100" w:name="exm-block-matrix"/>
+    <w:bookmarkEnd w:id="106"/>
+    <w:bookmarkStart w:id="107" w:name="exm-block-matrix"/>
     <w:p>
       <w:pPr>
         <w:pStyle w:val="BodyText"/>
@@ -30346,7 +32565,7 @@
           <w:b/>
           <w:bCs/>
         </w:rPr>
-        <w:t xml:space="preserve">Example 17 (Cutting a</w:t>
+        <w:t xml:space="preserve">Example 20 (Cutting a</w:t>
       </w:r>
       <w:r>
         <w:rPr>
@@ -31181,8 +33400,8 @@
         <w:t xml:space="preserve">.</w:t>
       </w:r>
     </w:p>
-    <w:bookmarkEnd w:id="100"/>
-    <w:bookmarkStart w:id="101" w:name="def-leading-block"/>
+    <w:bookmarkEnd w:id="107"/>
+    <w:bookmarkStart w:id="108" w:name="def-leading-block"/>
     <w:p>
       <w:pPr>
         <w:pStyle w:val="BodyText"/>
@@ -31562,8 +33781,8 @@
         <w:t xml:space="preserve">itself.</w:t>
       </w:r>
     </w:p>
-    <w:bookmarkEnd w:id="101"/>
-    <w:bookmarkStart w:id="102" w:name="thm-pd-submatrix"/>
+    <w:bookmarkEnd w:id="108"/>
+    <w:bookmarkStart w:id="109" w:name="thm-pd-submatrix"/>
     <w:p>
       <w:pPr>
         <w:pStyle w:val="BodyText"/>
@@ -31573,7 +33792,7 @@
           <w:b/>
           <w:bCs/>
         </w:rPr>
-        <w:t xml:space="preserve">Theorem 12 (Leading blocks of a positive definite matrix are positive definite)</w:t>
+        <w:t xml:space="preserve">Theorem 14 (Leading blocks of a positive definite matrix are positive definite)</w:t>
       </w:r>
       <w:r>
         <w:t xml:space="preserve"> </w:t>
@@ -31830,7 +34049,7 @@
         <w:t xml:space="preserve">Also, every diagonal entry of a positive definite matrix is positive.</w:t>
       </w:r>
     </w:p>
-    <w:bookmarkEnd w:id="102"/>
+    <w:bookmarkEnd w:id="109"/>
     <w:p>
       <w:pPr>
         <w:pStyle w:val="BodyText"/>
@@ -32150,7 +34369,7 @@
     $$</w:t>
       </w:r>
     </w:p>
-    <w:bookmarkStart w:id="104" w:name="exm-pd-submatrix"/>
+    <w:bookmarkStart w:id="111" w:name="exm-pd-submatrix"/>
     <w:p>
       <w:pPr>
         <w:pStyle w:val="FirstParagraph"/>
@@ -32160,7 +34379,7 @@
           <w:b/>
           <w:bCs/>
         </w:rPr>
-        <w:t xml:space="preserve">Example 18 (A quick necessary test)</w:t>
+        <w:t xml:space="preserve">Example 21 (A quick necessary test)</w:t>
       </w:r>
       <w:r>
         <w:t xml:space="preserve"> </w:t>
@@ -32511,7 +34730,7 @@
       <w:r>
         <w:t xml:space="preserve">(</w:t>
       </w:r>
-      <w:hyperlink r:id="rId103">
+      <w:hyperlink r:id="rId110">
         <w:r>
           <w:rPr>
             <w:rStyle w:val="Hyperlink"/>
@@ -32635,8 +34854,8 @@
         <w:t xml:space="preserve">but is not positive definite.</w:t>
       </w:r>
     </w:p>
-    <w:bookmarkEnd w:id="104"/>
-    <w:bookmarkStart w:id="107" w:name="thm-block-quadratic"/>
+    <w:bookmarkEnd w:id="111"/>
+    <w:bookmarkStart w:id="114" w:name="thm-block-quadratic"/>
     <w:p>
       <w:pPr>
         <w:pStyle w:val="BodyText"/>
@@ -32646,7 +34865,7 @@
           <w:b/>
           <w:bCs/>
         </w:rPr>
-        <w:t xml:space="preserve">Theorem 13 (The quadratic form of a block matrix)</w:t>
+        <w:t xml:space="preserve">Theorem 15 (The quadratic form of a block matrix)</w:t>
       </w:r>
       <w:r>
         <w:t xml:space="preserve"> </w:t>
@@ -33391,7 +35610,7 @@
       <w:r>
         <w:t xml:space="preserve">is symmetric (</w:t>
       </w:r>
-      <w:hyperlink r:id="rId105">
+      <w:hyperlink r:id="rId112">
         <w:r>
           <w:rPr>
             <w:rStyle w:val="Hyperlink"/>
@@ -33637,14 +35856,14 @@
       <w:pPr>
         <w:pStyle w:val="BodyText"/>
       </w:pPr>
-      <w:bookmarkStart w:id="106" w:name="eq-block-quadratic"/>
+      <w:bookmarkStart w:id="113" w:name="eq-block-quadratic"/>
       <w:r>
         <w:t xml:space="preserve">$$
     {\mathord{\smash[b]{\underset{\raise.3ex\hbox{$\scriptstyle\sim$}}{v}}\vphantom{v}}}^{\top} \mathbf{X} \mathord{\smash[b]{\underset{\raise.3ex\hbox{$\scriptstyle\sim$}}{v}}\vphantom{v}}
     = {\mathord{\smash[b]{\underset{\raise.3ex\hbox{$\scriptstyle\sim$}}{u}}\vphantom{u}}}^{\top} \mathbf{A} \mathord{\smash[b]{\underset{\raise.3ex\hbox{$\scriptstyle\sim$}}{u}}\vphantom{u}} + 2\,{\mathord{\smash[b]{\underset{\raise.3ex\hbox{$\scriptstyle\sim$}}{u}}\vphantom{u}}}^{\top} \mathbf{B} \mathord{\smash[b]{\underset{\raise.3ex\hbox{$\scriptstyle\sim$}}{w}}\vphantom{w}} + {\mathord{\smash[b]{\underset{\raise.3ex\hbox{$\scriptstyle\sim$}}{w}}\vphantom{w}}}^{\top} \mathbf{C} \mathord{\smash[b]{\underset{\raise.3ex\hbox{$\scriptstyle\sim$}}{w}}\vphantom{w}},
      \qquad(2)$$</w:t>
       </w:r>
-      <w:bookmarkEnd w:id="106"/>
+      <w:bookmarkEnd w:id="113"/>
     </w:p>
     <w:p>
       <w:pPr>
@@ -33783,7 +36002,7 @@
     $$</w:t>
       </w:r>
     </w:p>
-    <w:bookmarkEnd w:id="107"/>
+    <w:bookmarkEnd w:id="114"/>
     <w:p>
       <w:pPr>
         <w:pStyle w:val="FirstParagraph"/>
@@ -34054,7 +36273,7 @@
       <w:r>
         <w:t xml:space="preserve">is symmetric (</w:t>
       </w:r>
-      <w:hyperlink r:id="rId108">
+      <w:hyperlink r:id="rId115">
         <w:r>
           <w:rPr>
             <w:rStyle w:val="Hyperlink"/>
@@ -34187,7 +36406,7 @@
         <w:t xml:space="preserve">.</w:t>
       </w:r>
     </w:p>
-    <w:bookmarkStart w:id="109" w:name="exm-block-quadratic"/>
+    <w:bookmarkStart w:id="116" w:name="exm-block-quadratic"/>
     <w:p>
       <w:pPr>
         <w:pStyle w:val="BodyText"/>
@@ -34197,7 +36416,7 @@
           <w:b/>
           <w:bCs/>
         </w:rPr>
-        <w:t xml:space="preserve">Example 19 (The</w:t>
+        <w:t xml:space="preserve">Example 22 (The</w:t>
       </w:r>
       <w:r>
         <w:rPr>
@@ -35036,8 +37255,8 @@
         </m:oMath>
       </m:oMathPara>
     </w:p>
-    <w:bookmarkEnd w:id="109"/>
-    <w:bookmarkStart w:id="110" w:name="def-schur-complement"/>
+    <w:bookmarkEnd w:id="116"/>
+    <w:bookmarkStart w:id="117" w:name="def-schur-complement"/>
     <w:p>
       <w:pPr>
         <w:pStyle w:val="FirstParagraph"/>
@@ -35164,7 +37383,7 @@
           <w:rPr>
             <w:rStyle w:val="Hyperlink"/>
           </w:rPr>
-          <w:t xml:space="preserve">Theorem 13</w:t>
+          <w:t xml:space="preserve">Theorem 15</w:t>
         </w:r>
       </w:hyperlink>
       <w:r>
@@ -35357,15 +37576,15 @@
           <w:rPr>
             <w:rStyle w:val="Hyperlink"/>
           </w:rPr>
-          <w:t xml:space="preserve">Theorem 13</w:t>
+          <w:t xml:space="preserve">Theorem 15</w:t>
         </w:r>
       </w:hyperlink>
       <w:r>
         <w:t xml:space="preserve">.</w:t>
       </w:r>
     </w:p>
-    <w:bookmarkEnd w:id="110"/>
-    <w:bookmarkStart w:id="111" w:name="exm-schur-complement"/>
+    <w:bookmarkEnd w:id="117"/>
+    <w:bookmarkStart w:id="118" w:name="exm-schur-complement"/>
     <w:p>
       <w:pPr>
         <w:pStyle w:val="BodyText"/>
@@ -35375,7 +37594,7 @@
           <w:b/>
           <w:bCs/>
         </w:rPr>
-        <w:t xml:space="preserve">Example 20 (Schur complements of</w:t>
+        <w:t xml:space="preserve">Example 23 (Schur complements of</w:t>
       </w:r>
       <w:r>
         <w:rPr>
@@ -36082,8 +38301,8 @@
         <w:t xml:space="preserve">so there is no Schur complement of it.</w:t>
       </w:r>
     </w:p>
-    <w:bookmarkEnd w:id="111"/>
-    <w:bookmarkStart w:id="112" w:name="thm-schur-test"/>
+    <w:bookmarkEnd w:id="118"/>
+    <w:bookmarkStart w:id="119" w:name="thm-schur-test"/>
     <w:p>
       <w:pPr>
         <w:pStyle w:val="FirstParagraph"/>
@@ -36093,7 +38312,7 @@
           <w:b/>
           <w:bCs/>
         </w:rPr>
-        <w:t xml:space="preserve">Theorem 14 (Schur complement test)</w:t>
+        <w:t xml:space="preserve">Theorem 16 (Schur complement test)</w:t>
       </w:r>
       <w:r>
         <w:t xml:space="preserve"> </w:t>
@@ -36210,7 +38429,7 @@
           <w:rPr>
             <w:rStyle w:val="Hyperlink"/>
           </w:rPr>
-          <w:t xml:space="preserve">Theorem 13</w:t>
+          <w:t xml:space="preserve">Theorem 15</w:t>
         </w:r>
       </w:hyperlink>
       <w:r>
@@ -36308,7 +38527,7 @@
         <w:t xml:space="preserve">) is positive definite.</w:t>
       </w:r>
     </w:p>
-    <w:bookmarkEnd w:id="112"/>
+    <w:bookmarkEnd w:id="119"/>
     <w:p>
       <w:pPr>
         <w:pStyle w:val="BodyText"/>
@@ -36347,7 +38566,7 @@
       <w:r>
         <w:t xml:space="preserve">is positive definite, so invertible (</w:t>
       </w:r>
-      <w:hyperlink r:id="rId113">
+      <w:hyperlink r:id="rId120">
         <w:r>
           <w:rPr>
             <w:rStyle w:val="Hyperlink"/>
@@ -36433,7 +38652,7 @@
           <w:rPr>
             <w:rStyle w:val="Hyperlink"/>
           </w:rPr>
-          <w:t xml:space="preserve">Theorem 13</w:t>
+          <w:t xml:space="preserve">Theorem 15</w:t>
         </w:r>
       </w:hyperlink>
       <w:r>
@@ -36602,7 +38821,7 @@
           <w:rPr>
             <w:rStyle w:val="Hyperlink"/>
           </w:rPr>
-          <w:t xml:space="preserve">Theorem 12</w:t>
+          <w:t xml:space="preserve">Theorem 14</w:t>
         </w:r>
       </w:hyperlink>
       <w:r>
@@ -36614,7 +38833,7 @@
       <w:r>
         <w:t xml:space="preserve">and invertible (</w:t>
       </w:r>
-      <w:hyperlink r:id="rId113">
+      <w:hyperlink r:id="rId120">
         <w:r>
           <w:rPr>
             <w:rStyle w:val="Hyperlink"/>
@@ -36968,7 +39187,7 @@
       <w:r>
         <w:t xml:space="preserve"> </w:t>
       </w:r>
-      <w:hyperlink r:id="rId108">
+      <w:hyperlink r:id="rId115">
         <w:r>
           <w:rPr>
             <w:rStyle w:val="Hyperlink"/>
@@ -37170,14 +39389,14 @@
           <w:rPr>
             <w:rStyle w:val="Hyperlink"/>
           </w:rPr>
-          <w:t xml:space="preserve">Theorem 13</w:t>
+          <w:t xml:space="preserve">Theorem 15</w:t>
         </w:r>
       </w:hyperlink>
       <w:r>
         <w:t xml:space="preserve">).</w:t>
       </w:r>
     </w:p>
-    <w:bookmarkStart w:id="114" w:name="exm-schur-test"/>
+    <w:bookmarkStart w:id="121" w:name="exm-schur-test"/>
     <w:p>
       <w:pPr>
         <w:pStyle w:val="BodyText"/>
@@ -37187,7 +39406,7 @@
           <w:b/>
           <w:bCs/>
         </w:rPr>
-        <w:t xml:space="preserve">Example 21 (Testing</w:t>
+        <w:t xml:space="preserve">Example 24 (Testing</w:t>
       </w:r>
       <w:r>
         <w:rPr>
@@ -37682,7 +39901,7 @@
           <w:rPr>
             <w:rStyle w:val="Hyperlink"/>
           </w:rPr>
-          <w:t xml:space="preserve">Example 20</w:t>
+          <w:t xml:space="preserve">Example 23</w:t>
         </w:r>
       </w:hyperlink>
       <w:r>
@@ -37850,8 +40069,8 @@
         <w:t xml:space="preserve">found directly.</w:t>
       </w:r>
     </w:p>
-    <w:bookmarkEnd w:id="114"/>
-    <w:bookmarkStart w:id="116" w:name="thm-cholesky"/>
+    <w:bookmarkEnd w:id="121"/>
+    <w:bookmarkStart w:id="123" w:name="thm-cholesky"/>
     <w:p>
       <w:pPr>
         <w:pStyle w:val="FirstParagraph"/>
@@ -37861,7 +40080,7 @@
           <w:b/>
           <w:bCs/>
         </w:rPr>
-        <w:t xml:space="preserve">Theorem 15 (Cholesky factorization)</w:t>
+        <w:t xml:space="preserve">Theorem 17 (Cholesky factorization)</w:t>
       </w:r>
       <w:r>
         <w:t xml:space="preserve"> </w:t>
@@ -37990,7 +40209,7 @@
       <w:r>
         <w:t xml:space="preserve">(</w:t>
       </w:r>
-      <w:hyperlink r:id="rId115">
+      <w:hyperlink r:id="rId122">
         <w:r>
           <w:rPr>
             <w:rStyle w:val="Hyperlink"/>
@@ -38078,7 +40297,7 @@
         <w:t xml:space="preserve">.</w:t>
       </w:r>
     </w:p>
-    <w:bookmarkEnd w:id="116"/>
+    <w:bookmarkEnd w:id="123"/>
     <w:p>
       <w:pPr>
         <w:pStyle w:val="BodyText"/>
@@ -38521,7 +40740,7 @@
           <w:rPr>
             <w:rStyle w:val="Hyperlink"/>
           </w:rPr>
-          <w:t xml:space="preserve">Theorem 12</w:t>
+          <w:t xml:space="preserve">Theorem 14</w:t>
         </w:r>
       </w:hyperlink>
       <w:r>
@@ -40261,7 +42480,7 @@
           <w:rPr>
             <w:rStyle w:val="Hyperlink"/>
           </w:rPr>
-          <w:t xml:space="preserve">Theorem 12</w:t>
+          <w:t xml:space="preserve">Theorem 14</w:t>
         </w:r>
       </w:hyperlink>
       <w:r>
@@ -40606,7 +42825,7 @@
           <w:rPr>
             <w:rStyle w:val="Hyperlink"/>
           </w:rPr>
-          <w:t xml:space="preserve">Theorem 14</w:t>
+          <w:t xml:space="preserve">Theorem 16</w:t>
         </w:r>
       </w:hyperlink>
       <w:r>
@@ -40734,7 +42953,7 @@
         <w:t xml:space="preserve">exists and is unique.</w:t>
       </w:r>
     </w:p>
-    <w:bookmarkStart w:id="117" w:name="exm-cholesky"/>
+    <w:bookmarkStart w:id="124" w:name="exm-cholesky"/>
     <w:p>
       <w:pPr>
         <w:pStyle w:val="BodyText"/>
@@ -40744,7 +42963,7 @@
           <w:b/>
           <w:bCs/>
         </w:rPr>
-        <w:t xml:space="preserve">Example 22 (Two Cholesky factors)</w:t>
+        <w:t xml:space="preserve">Example 25 (Two Cholesky factors)</w:t>
       </w:r>
       <w:r>
         <w:t xml:space="preserve"> </w:t>
@@ -41629,7 +43848,7 @@
           <w:rPr>
             <w:rStyle w:val="Hyperlink"/>
           </w:rPr>
-          <w:t xml:space="preserve">Example 20</w:t>
+          <w:t xml:space="preserve">Example 23</w:t>
         </w:r>
       </w:hyperlink>
       <w:r>
@@ -41874,16 +44093,16 @@
           <w:rPr>
             <w:rStyle w:val="Hyperlink"/>
           </w:rPr>
-          <w:t xml:space="preserve">Example 21</w:t>
+          <w:t xml:space="preserve">Example 24</w:t>
         </w:r>
       </w:hyperlink>
       <w:r>
         <w:t xml:space="preserve">).</w:t>
       </w:r>
     </w:p>
-    <w:bookmarkEnd w:id="117"/>
-    <w:bookmarkStart w:id="122" w:name="refs"/>
-    <w:bookmarkStart w:id="119" w:name="ref-zhou2024eig"/>
+    <w:bookmarkEnd w:id="124"/>
+    <w:bookmarkStart w:id="129" w:name="refs"/>
+    <w:bookmarkStart w:id="126" w:name="ref-zhou2024eig"/>
     <w:p>
       <w:pPr>
         <w:pStyle w:val="Bibliography"/>
@@ -41907,7 +44126,7 @@
       <w:r>
         <w:t xml:space="preserve"> </w:t>
       </w:r>
-      <w:hyperlink r:id="rId118">
+      <w:hyperlink r:id="rId125">
         <w:r>
           <w:rPr>
             <w:rStyle w:val="Hyperlink"/>
@@ -41919,8 +44138,8 @@
         <w:t xml:space="preserve">.</w:t>
       </w:r>
     </w:p>
-    <w:bookmarkEnd w:id="119"/>
-    <w:bookmarkStart w:id="121" w:name="ref-zhou2024pd"/>
+    <w:bookmarkEnd w:id="126"/>
+    <w:bookmarkStart w:id="128" w:name="ref-zhou2024pd"/>
     <w:p>
       <w:pPr>
         <w:pStyle w:val="Bibliography"/>
@@ -41944,7 +44163,7 @@
       <w:r>
         <w:t xml:space="preserve"> </w:t>
       </w:r>
-      <w:hyperlink r:id="rId120">
+      <w:hyperlink r:id="rId127">
         <w:r>
           <w:rPr>
             <w:rStyle w:val="Hyperlink"/>
@@ -41956,9 +44175,9 @@
         <w:t xml:space="preserve">.</w:t>
       </w:r>
     </w:p>
-    <w:bookmarkEnd w:id="121"/>
-    <w:bookmarkEnd w:id="122"/>
-    <w:bookmarkEnd w:id="123"/>
+    <w:bookmarkEnd w:id="128"/>
+    <w:bookmarkEnd w:id="129"/>
+    <w:bookmarkEnd w:id="130"/>
     <w:sectPr>
       <w:footnotePr>
         <w:numRestart w:val="eachSect"/>

</xml_diff>

<commit_message>
Deploying to gh-pages from @ Morrison-Lab/mds@2e67aeeca24208e7b4986ef1f3736c79cb797eb8 🚀
</commit_message>
<xml_diff>
--- a/linear-algebra-diagonalization.docx
+++ b/linear-algebra-diagonalization.docx
@@ -15,7 +15,7 @@
         <w:pStyle w:val="Date"/>
       </w:pPr>
       <w:r>
-        <w:t xml:space="preserve">Last modified: 2026-10-29 00:14:30 (PDT)</w:t>
+        <w:t xml:space="preserve">Last modified: 2026-10-29 01:38:31 (PDT)</w:t>
       </w:r>
     </w:p>
     <w:bookmarkStart w:id="80" w:name="sec-diagonalization"/>
@@ -34985,7 +34985,7 @@
           <w:rPr>
             <w:rStyle w:val="Hyperlink"/>
           </w:rPr>
-          <w:t xml:space="preserve">Definition 26 in Special Matrices and Decompositions</w:t>
+          <w:t xml:space="preserve">Definition 27 in Special Matrices and Decompositions</w:t>
         </w:r>
       </w:hyperlink>
       <w:r>

</xml_diff>

<commit_message>
Deploying to gh-pages from @ Morrison-Lab/mds@26716c80713cb50bd698aa78ba6fc53e018e06f0 🚀
</commit_message>
<xml_diff>
--- a/linear-algebra-diagonalization.docx
+++ b/linear-algebra-diagonalization.docx
@@ -15,7 +15,7 @@
         <w:pStyle w:val="Date"/>
       </w:pPr>
       <w:r>
-        <w:t xml:space="preserve">Last modified: 2026-10-29 09:12:46 (PDT)</w:t>
+        <w:t xml:space="preserve">Last modified: 2026-10-29 10:33:15 (PDT)</w:t>
       </w:r>
     </w:p>
     <w:bookmarkStart w:id="80" w:name="sec-diagonalization"/>
@@ -34985,7 +34985,7 @@
           <w:rPr>
             <w:rStyle w:val="Hyperlink"/>
           </w:rPr>
-          <w:t xml:space="preserve">Definition 27 in Special Matrices and Decompositions</w:t>
+          <w:t xml:space="preserve">Definition 30 in Special Matrices and Decompositions</w:t>
         </w:r>
       </w:hyperlink>
       <w:r>
@@ -38827,7 +38827,7 @@
           <w:rPr>
             <w:rStyle w:val="Hyperlink"/>
           </w:rPr>
-          <w:t xml:space="preserve">Theorem 18 in Special Matrices and Decompositions</w:t>
+          <w:t xml:space="preserve">Theorem 19 in Special Matrices and Decompositions</w:t>
         </w:r>
       </w:hyperlink>
       <w:r>
@@ -39094,7 +39094,7 @@
           <w:rPr>
             <w:rStyle w:val="Hyperlink"/>
           </w:rPr>
-          <w:t xml:space="preserve">Theorem 18 in Special Matrices and Decompositions</w:t>
+          <w:t xml:space="preserve">Theorem 19 in Special Matrices and Decompositions</w:t>
         </w:r>
       </w:hyperlink>
       <w:r>

</xml_diff>

<commit_message>
Deploying to gh-pages from @ Morrison-Lab/mds@435081ffbfbb3be6354729c5938c20c34df99522 🚀
</commit_message>
<xml_diff>
--- a/linear-algebra-diagonalization.docx
+++ b/linear-algebra-diagonalization.docx
@@ -15,7 +15,7 @@
         <w:pStyle w:val="Date"/>
       </w:pPr>
       <w:r>
-        <w:t xml:space="preserve">Last modified: 2026-10-29 10:33:15 (PDT)</w:t>
+        <w:t xml:space="preserve">Last modified: 2026-10-29 11:51:41 (PDT)</w:t>
       </w:r>
     </w:p>
     <w:bookmarkStart w:id="80" w:name="sec-diagonalization"/>
@@ -246,7 +246,7 @@
                 <w:rPr>
                   <w:rStyle w:val="Hyperlink"/>
                 </w:rPr>
-                <w:t xml:space="preserve">Theorem 12 in Special Matrices and Decompositions</w:t>
+                <w:t xml:space="preserve">Theorem 13 in Special Matrices and Decompositions</w:t>
               </w:r>
             </w:hyperlink>
             <w:r>
@@ -263,7 +263,7 @@
                 <w:rPr>
                   <w:rStyle w:val="Hyperlink"/>
                 </w:rPr>
-                <w:t xml:space="preserve">Theorem 13 in Special Matrices and Decompositions</w:t>
+                <w:t xml:space="preserve">Theorem 14 in Special Matrices and Decompositions</w:t>
               </w:r>
             </w:hyperlink>
             <w:r>
@@ -2670,7 +2670,7 @@
           <w:rPr>
             <w:rStyle w:val="Hyperlink"/>
           </w:rPr>
-          <w:t xml:space="preserve">Example 24 in Special Matrices and Decompositions</w:t>
+          <w:t xml:space="preserve">Example 25 in Special Matrices and Decompositions</w:t>
         </w:r>
       </w:hyperlink>
       <w:r>
@@ -5083,7 +5083,7 @@
           <w:rPr>
             <w:rStyle w:val="Hyperlink"/>
           </w:rPr>
-          <w:t xml:space="preserve">Example 24 in Special Matrices and Decompositions</w:t>
+          <w:t xml:space="preserve">Example 25 in Special Matrices and Decompositions</w:t>
         </w:r>
       </w:hyperlink>
       <w:r>
@@ -6251,7 +6251,7 @@
           <w:rPr>
             <w:rStyle w:val="Hyperlink"/>
           </w:rPr>
-          <w:t xml:space="preserve">Example 24 in Special Matrices and Decompositions</w:t>
+          <w:t xml:space="preserve">Example 25 in Special Matrices and Decompositions</w:t>
         </w:r>
       </w:hyperlink>
       <w:r>
@@ -9802,7 +9802,7 @@
     \begin{aligned}
     \mathopen{}\left\lVert\mathord{\smash[b]{\underset{\raise.3ex\hbox{$\scriptstyle\sim$}}{v}}\vphantom{v}}\right\rVert\mathclose{}
     &amp;= \mathopen{}\left\lVert\mathbf{A} \mathord{\smash[b]{\underset{\raise.3ex\hbox{$\scriptstyle\sim$}}{v}}\vphantom{v}}\right\rVert\mathclose{}
-    &amp;&amp; \text{(}\text{Theorem~6 in Special Matrices and Decompositions}\text{)}
+    &amp;&amp; \text{(}\text{Theorem~7 in Special Matrices and Decompositions}\text{)}
     \\
     &amp;= \mathopen{}\left\lVert\lambda\mathord{\smash[b]{\underset{\raise.3ex\hbox{$\scriptstyle\sim$}}{v}}\vphantom{v}}\right\rVert\mathclose{}
     &amp;&amp; \text{(eigenvector)}
@@ -10645,7 +10645,7 @@
           <w:rPr>
             <w:rStyle w:val="Hyperlink"/>
           </w:rPr>
-          <w:t xml:space="preserve">Example 13 in Special Matrices and Decompositions</w:t>
+          <w:t xml:space="preserve">Example 14 in Special Matrices and Decompositions</w:t>
         </w:r>
       </w:hyperlink>
       <w:r>
@@ -15955,7 +15955,7 @@
           <w:rPr>
             <w:rStyle w:val="Hyperlink"/>
           </w:rPr>
-          <w:t xml:space="preserve">Example 24 in Special Matrices and Decompositions</w:t>
+          <w:t xml:space="preserve">Example 25 in Special Matrices and Decompositions</w:t>
         </w:r>
       </w:hyperlink>
       <w:r>
@@ -16676,7 +16676,7 @@
           <w:rPr>
             <w:rStyle w:val="Hyperlink"/>
           </w:rPr>
-          <w:t xml:space="preserve">Example 24 in Special Matrices and Decompositions</w:t>
+          <w:t xml:space="preserve">Example 25 in Special Matrices and Decompositions</w:t>
         </w:r>
       </w:hyperlink>
       <w:r>
@@ -20140,7 +20140,7 @@
           <w:rPr>
             <w:rStyle w:val="Hyperlink"/>
           </w:rPr>
-          <w:t xml:space="preserve">Theorem 12 in Special Matrices and Decompositions</w:t>
+          <w:t xml:space="preserve">Theorem 13 in Special Matrices and Decompositions</w:t>
         </w:r>
       </w:hyperlink>
       <w:r>
@@ -20571,7 +20571,7 @@
           <w:rPr>
             <w:rStyle w:val="Hyperlink"/>
           </w:rPr>
-          <w:t xml:space="preserve">Theorem 12 in Special Matrices and Decompositions</w:t>
+          <w:t xml:space="preserve">Theorem 13 in Special Matrices and Decompositions</w:t>
         </w:r>
       </w:hyperlink>
       <w:r>
@@ -24325,7 +24325,7 @@
                 <w:rPr>
                   <w:rStyle w:val="Hyperlink"/>
                 </w:rPr>
-                <w:t xml:space="preserve">Theorem 17 in Special Matrices and Decompositions</w:t>
+                <w:t xml:space="preserve">Theorem 18 in Special Matrices and Decompositions</w:t>
               </w:r>
             </w:hyperlink>
             <w:r>
@@ -25456,7 +25456,7 @@
           <w:rPr>
             <w:rStyle w:val="Hyperlink"/>
           </w:rPr>
-          <w:t xml:space="preserve">Theorem 12 in Special Matrices and Decompositions</w:t>
+          <w:t xml:space="preserve">Theorem 13 in Special Matrices and Decompositions</w:t>
         </w:r>
       </w:hyperlink>
       <w:r>
@@ -25505,7 +25505,7 @@
           <w:rPr>
             <w:rStyle w:val="Hyperlink"/>
           </w:rPr>
-          <w:t xml:space="preserve">Theorem 17 in Special Matrices and Decompositions</w:t>
+          <w:t xml:space="preserve">Theorem 18 in Special Matrices and Decompositions</w:t>
         </w:r>
       </w:hyperlink>
       <w:r>
@@ -26335,7 +26335,7 @@
                   <m:nor/>
                   <m:sty m:val="p"/>
                 </m:rPr>
-                <m:t>Theorem 12 in Special Matrices and Decompositions</m:t>
+                <m:t>Theorem 13 in Special Matrices and Decompositions</m:t>
               </m:r>
               <m:r>
                 <m:rPr>
@@ -26488,7 +26488,7 @@
           <w:rPr>
             <w:rStyle w:val="Hyperlink"/>
           </w:rPr>
-          <w:t xml:space="preserve">Theorem 17 in Special Matrices and Decompositions</w:t>
+          <w:t xml:space="preserve">Theorem 18 in Special Matrices and Decompositions</w:t>
         </w:r>
       </w:hyperlink>
       <w:r>
@@ -26998,7 +26998,7 @@
           <w:rPr>
             <w:rStyle w:val="Hyperlink"/>
           </w:rPr>
-          <w:t xml:space="preserve">Example 30 in Special Matrices and Decompositions</w:t>
+          <w:t xml:space="preserve">Example 31 in Special Matrices and Decompositions</w:t>
         </w:r>
       </w:hyperlink>
       <w:r>
@@ -27103,7 +27103,7 @@
           <w:rPr>
             <w:rStyle w:val="Hyperlink"/>
           </w:rPr>
-          <w:t xml:space="preserve">Example 32 in Special Matrices and Decompositions</w:t>
+          <w:t xml:space="preserve">Example 33 in Special Matrices and Decompositions</w:t>
         </w:r>
       </w:hyperlink>
       <w:r>
@@ -27421,7 +27421,7 @@
           <w:rPr>
             <w:rStyle w:val="Hyperlink"/>
           </w:rPr>
-          <w:t xml:space="preserve">Example 32 in Special Matrices and Decompositions</w:t>
+          <w:t xml:space="preserve">Example 33 in Special Matrices and Decompositions</w:t>
         </w:r>
       </w:hyperlink>
       <w:r>
@@ -28878,7 +28878,7 @@
           <w:rPr>
             <w:rStyle w:val="Hyperlink"/>
           </w:rPr>
-          <w:t xml:space="preserve">Example 32 in Special Matrices and Decompositions</w:t>
+          <w:t xml:space="preserve">Example 33 in Special Matrices and Decompositions</w:t>
         </w:r>
       </w:hyperlink>
       <w:r>
@@ -29520,7 +29520,7 @@
           <w:rPr>
             <w:rStyle w:val="Hyperlink"/>
           </w:rPr>
-          <w:t xml:space="preserve">Example 24 in Special Matrices and Decompositions</w:t>
+          <w:t xml:space="preserve">Example 25 in Special Matrices and Decompositions</w:t>
         </w:r>
       </w:hyperlink>
       <w:r>
@@ -30521,7 +30521,7 @@
           <w:rPr>
             <w:rStyle w:val="Hyperlink"/>
           </w:rPr>
-          <w:t xml:space="preserve">Example 32 in Special Matrices and Decompositions</w:t>
+          <w:t xml:space="preserve">Example 33 in Special Matrices and Decompositions</w:t>
         </w:r>
       </w:hyperlink>
       <w:r>
@@ -31161,7 +31161,7 @@
           <w:rPr>
             <w:rStyle w:val="Hyperlink"/>
           </w:rPr>
-          <w:t xml:space="preserve">Example 30 in Special Matrices and Decompositions</w:t>
+          <w:t xml:space="preserve">Example 31 in Special Matrices and Decompositions</w:t>
         </w:r>
       </w:hyperlink>
       <w:r>
@@ -35088,7 +35088,7 @@
           <w:rPr>
             <w:rStyle w:val="Hyperlink"/>
           </w:rPr>
-          <w:t xml:space="preserve">Example 32 in Special Matrices and Decompositions</w:t>
+          <w:t xml:space="preserve">Example 33 in Special Matrices and Decompositions</w:t>
         </w:r>
       </w:hyperlink>
       <w:r>
@@ -38827,7 +38827,7 @@
           <w:rPr>
             <w:rStyle w:val="Hyperlink"/>
           </w:rPr>
-          <w:t xml:space="preserve">Theorem 19 in Special Matrices and Decompositions</w:t>
+          <w:t xml:space="preserve">Theorem 20 in Special Matrices and Decompositions</w:t>
         </w:r>
       </w:hyperlink>
       <w:r>
@@ -39094,7 +39094,7 @@
           <w:rPr>
             <w:rStyle w:val="Hyperlink"/>
           </w:rPr>
-          <w:t xml:space="preserve">Theorem 19 in Special Matrices and Decompositions</w:t>
+          <w:t xml:space="preserve">Theorem 20 in Special Matrices and Decompositions</w:t>
         </w:r>
       </w:hyperlink>
       <w:r>
@@ -40315,7 +40315,7 @@
           <w:rPr>
             <w:rStyle w:val="Hyperlink"/>
           </w:rPr>
-          <w:t xml:space="preserve">Example 32 in Special Matrices and Decompositions</w:t>
+          <w:t xml:space="preserve">Example 33 in Special Matrices and Decompositions</w:t>
         </w:r>
       </w:hyperlink>
       <w:r>

</xml_diff>

<commit_message>
Deploying to gh-pages from @ Morrison-Lab/mds@3817775e2e963374daddcd8412f00986902c07da 🚀
</commit_message>
<xml_diff>
--- a/linear-algebra-diagonalization.docx
+++ b/linear-algebra-diagonalization.docx
@@ -15,7 +15,7 @@
         <w:pStyle w:val="Date"/>
       </w:pPr>
       <w:r>
-        <w:t xml:space="preserve">Last modified: 2026-10-30 00:52:40 (PDT)</w:t>
+        <w:t xml:space="preserve">Last modified: 2026-10-30 02:22:19 (PDT)</w:t>
       </w:r>
     </w:p>
     <w:bookmarkStart w:id="80" w:name="sec-diagonalization"/>
@@ -713,7 +713,7 @@
           <w:rPr>
             <w:rStyle w:val="Hyperlink"/>
           </w:rPr>
-          <w:t xml:space="preserve">Theorem 7 in Column Space, Null Space and Rank-Nullity</w:t>
+          <w:t xml:space="preserve">Theorem 8 in Column Space, Null Space and Rank-Nullity</w:t>
         </w:r>
       </w:hyperlink>
       <w:r>
@@ -1542,7 +1542,7 @@
           <w:rPr>
             <w:rStyle w:val="Hyperlink"/>
           </w:rPr>
-          <w:t xml:space="preserve">Theorem 7 in Column Space, Null Space and Rank-Nullity</w:t>
+          <w:t xml:space="preserve">Theorem 8 in Column Space, Null Space and Rank-Nullity</w:t>
         </w:r>
       </w:hyperlink>
       <w:r>
@@ -31620,7 +31620,7 @@
     &amp;&amp; \text{(}\text{Theorem~1}\text{)}
     \\
     &amp;\iff \mathcal{N}(\mathbf{X}) = \mathopen{}\left\{\mathord{\smash[b]{\underset{\raise.3ex\hbox{$\scriptstyle\sim$}}{0}}\vphantom{0}}_p\right\}\mathclose{}
-    &amp;&amp; \text{(}\text{Theorem~5 in Column Space, Null Space and Rank-Nullity}\text{)}
+    &amp;&amp; \text{(}\text{Theorem~6 in Column Space, Null Space and Rank-Nullity}\text{)}
     \\
     &amp;\iff \mathbf{X}\text{ has full column rank.}
     &amp;&amp; \text{(}\text{Theorem~3 in Column Space, Null Space and Rank-Nullity}\text{)}

</xml_diff>

<commit_message>
Deploying to gh-pages from @ Morrison-Lab/mds@20d60d170f83b68dbb428eda7dd974e30789a2fe 🚀
</commit_message>
<xml_diff>
--- a/linear-algebra-diagonalization.docx
+++ b/linear-algebra-diagonalization.docx
@@ -15,7 +15,7 @@
         <w:pStyle w:val="Date"/>
       </w:pPr>
       <w:r>
-        <w:t xml:space="preserve">Last modified: 2026-10-30 17:15:43 (PDT)</w:t>
+        <w:t xml:space="preserve">Last modified: 2026-10-30 18:45:42 (PDT)</w:t>
       </w:r>
     </w:p>
     <w:bookmarkStart w:id="80" w:name="sec-diagonalization"/>
@@ -786,7 +786,7 @@
           <w:rPr>
             <w:rStyle w:val="Hyperlink"/>
           </w:rPr>
-          <w:t xml:space="preserve">Corollary 1 in Projections and Linear Systems</w:t>
+          <w:t xml:space="preserve">Corollary 2 in Projections and Linear Systems</w:t>
         </w:r>
       </w:hyperlink>
       <w:r>
@@ -8689,7 +8689,7 @@
           <w:rPr>
             <w:rStyle w:val="Hyperlink"/>
           </w:rPr>
-          <w:t xml:space="preserve">Example 26 in Projections and Linear Systems</w:t>
+          <w:t xml:space="preserve">Example 27 in Projections and Linear Systems</w:t>
         </w:r>
       </w:hyperlink>
       <w:r>

</xml_diff>